<commit_message>
Return 545.045 with the measured branching ratio; measured BR for 545.090, 543.896
nbtools: XE2_BR_MEASURED (from docs/crm/branching_measured.csv) and br="measured";
ne pair 561.667 / 545.045 (557.219 backup); notebook 02 prints all BR variants.
Level 101 (483.025) checked and rejected.  Guide (no code) for wavelength
calibration, sensitivity calibration and line selection:
docs/crm/guide_calibration_and_lines.md/.docx.  branching_from_spectrum.py --lines.

Co-Authored-By: Claude Opus 5.5 <noreply@anthropic.com>
Claude-Session: https://claude.ai/code/session_018nKkrJu4ehWWcEHTugH1GR
</commit_message>
<xml_diff>
--- a/docs/crm/lines_final.docx
+++ b/docs/crm/lines_final.docx
@@ -752,7 +752,7 @@
         <w:t xml:space="preserve"> </w:t>
       </w:r>
       <w:r>
-        <w:t xml:space="preserve">(в спектре A3 все пять не насыщены ни в одном из 11 листов):</w:t>
+        <w:t xml:space="preserve">(в спектре A3 все шесть не насыщены ни в одном из 11 листов):</w:t>
       </w:r>
     </w:p>
     <w:tbl>
@@ -920,7 +920,7 @@
               <w:rPr>
                 <w:sz w:val="18"/>
               </w:rPr>
-              <w:t xml:space="preserve">0.048 — расчёт DBSR</w:t>
+              <w:t xml:space="preserve">0.048 — расчёт DBSR (измерено 0.049)</w:t>
             </w:r>
           </w:p>
         </w:tc>
@@ -938,21 +938,21 @@
                 <w:bCs/>
                 <w:sz w:val="18"/>
               </w:rPr>
-              <w:t xml:space="preserve">557.219</w:t>
-            </w:r>
-          </w:p>
-        </w:tc>
-        <w:tc>
-          <w:tcPr/>
-          <w:p>
-            <w:pPr>
-              <w:pStyle w:val="Compact"/>
-            </w:pPr>
-            <w:r>
-              <w:rPr>
-                <w:sz w:val="18"/>
-              </w:rPr>
-              <w:t xml:space="preserve">42</w:t>
+              <w:t xml:space="preserve">545.045</w:t>
+            </w:r>
+          </w:p>
+        </w:tc>
+        <w:tc>
+          <w:tcPr/>
+          <w:p>
+            <w:pPr>
+              <w:pStyle w:val="Compact"/>
+            </w:pPr>
+            <w:r>
+              <w:rPr>
+                <w:sz w:val="18"/>
+              </w:rPr>
+              <w:t xml:space="preserve">44</w:t>
             </w:r>
           </w:p>
         </w:tc>
@@ -980,21 +980,35 @@
               <w:rPr>
                 <w:sz w:val="18"/>
               </w:rPr>
-              <w:t xml:space="preserve">видна, одиночная</w:t>
-            </w:r>
-          </w:p>
-        </w:tc>
-        <w:tc>
-          <w:tcPr/>
-          <w:p>
-            <w:pPr>
-              <w:pStyle w:val="Compact"/>
-            </w:pPr>
-            <w:r>
-              <w:rPr>
-                <w:sz w:val="18"/>
-              </w:rPr>
-              <w:t xml:space="preserve">0.018 — DBSR + NIST</w:t>
+              <w:t xml:space="preserve">видна, в дублете с 545.090 — разделяется фитом двумя контурами</w:t>
+            </w:r>
+          </w:p>
+        </w:tc>
+        <w:tc>
+          <w:tcPr/>
+          <w:p>
+            <w:pPr>
+              <w:pStyle w:val="Compact"/>
+            </w:pPr>
+            <w:r>
+              <w:rPr>
+                <w:b/>
+                <w:bCs/>
+                <w:sz w:val="18"/>
+              </w:rPr>
+              <w:t xml:space="preserve">0.056 — измерено</w:t>
+            </w:r>
+            <w:r>
+              <w:rPr>
+                <w:sz w:val="18"/>
+              </w:rPr>
+              <w:t xml:space="preserve"> </w:t>
+            </w:r>
+            <w:r>
+              <w:rPr>
+                <w:sz w:val="18"/>
+              </w:rPr>
+              <w:t xml:space="preserve">(п. 6.1; DBSR неверен)</w:t>
             </w:r>
           </w:p>
         </w:tc>
@@ -1012,63 +1026,63 @@
                 <w:bCs/>
                 <w:sz w:val="18"/>
               </w:rPr>
-              <w:t xml:space="preserve">545.090</w:t>
-            </w:r>
-          </w:p>
-        </w:tc>
-        <w:tc>
-          <w:tcPr/>
-          <w:p>
-            <w:pPr>
-              <w:pStyle w:val="Compact"/>
-            </w:pPr>
-            <w:r>
-              <w:rPr>
-                <w:sz w:val="18"/>
-              </w:rPr>
-              <w:t xml:space="preserve">51</w:t>
-            </w:r>
-          </w:p>
-        </w:tc>
-        <w:tc>
-          <w:tcPr/>
-          <w:p>
-            <w:pPr>
-              <w:pStyle w:val="Compact"/>
-            </w:pPr>
-            <w:r>
-              <w:rPr>
-                <w:sz w:val="18"/>
-              </w:rPr>
-              <w:t xml:space="preserve">Te</w:t>
-            </w:r>
-          </w:p>
-        </w:tc>
-        <w:tc>
-          <w:tcPr/>
-          <w:p>
-            <w:pPr>
-              <w:pStyle w:val="Compact"/>
-            </w:pPr>
-            <w:r>
-              <w:rPr>
-                <w:sz w:val="18"/>
-              </w:rPr>
-              <w:t xml:space="preserve">видна, в бленде с 545.045 — разделяется фитом двумя контурами</w:t>
-            </w:r>
-          </w:p>
-        </w:tc>
-        <w:tc>
-          <w:tcPr/>
-          <w:p>
-            <w:pPr>
-              <w:pStyle w:val="Compact"/>
-            </w:pPr>
-            <w:r>
-              <w:rPr>
-                <w:sz w:val="18"/>
-              </w:rPr>
-              <w:t xml:space="preserve">0.037 — расчёт DBSR</w:t>
+              <w:t xml:space="preserve">557.219</w:t>
+            </w:r>
+          </w:p>
+        </w:tc>
+        <w:tc>
+          <w:tcPr/>
+          <w:p>
+            <w:pPr>
+              <w:pStyle w:val="Compact"/>
+            </w:pPr>
+            <w:r>
+              <w:rPr>
+                <w:sz w:val="18"/>
+              </w:rPr>
+              <w:t xml:space="preserve">42</w:t>
+            </w:r>
+          </w:p>
+        </w:tc>
+        <w:tc>
+          <w:tcPr/>
+          <w:p>
+            <w:pPr>
+              <w:pStyle w:val="Compact"/>
+            </w:pPr>
+            <w:r>
+              <w:rPr>
+                <w:sz w:val="18"/>
+              </w:rPr>
+              <w:t xml:space="preserve">ne (запасная)</w:t>
+            </w:r>
+          </w:p>
+        </w:tc>
+        <w:tc>
+          <w:tcPr/>
+          <w:p>
+            <w:pPr>
+              <w:pStyle w:val="Compact"/>
+            </w:pPr>
+            <w:r>
+              <w:rPr>
+                <w:sz w:val="18"/>
+              </w:rPr>
+              <w:t xml:space="preserve">видна, одиночная</w:t>
+            </w:r>
+          </w:p>
+        </w:tc>
+        <w:tc>
+          <w:tcPr/>
+          <w:p>
+            <w:pPr>
+              <w:pStyle w:val="Compact"/>
+            </w:pPr>
+            <w:r>
+              <w:rPr>
+                <w:sz w:val="18"/>
+              </w:rPr>
+              <w:t xml:space="preserve">0.018 — DBSR + NIST (измерено 0.027)</w:t>
             </w:r>
           </w:p>
         </w:tc>
@@ -1086,21 +1100,21 @@
                 <w:bCs/>
                 <w:sz w:val="18"/>
               </w:rPr>
-              <w:t xml:space="preserve">553.107</w:t>
-            </w:r>
-          </w:p>
-        </w:tc>
-        <w:tc>
-          <w:tcPr/>
-          <w:p>
-            <w:pPr>
-              <w:pStyle w:val="Compact"/>
-            </w:pPr>
-            <w:r>
-              <w:rPr>
-                <w:sz w:val="18"/>
-              </w:rPr>
-              <w:t xml:space="preserve">29</w:t>
+              <w:t xml:space="preserve">545.090</w:t>
+            </w:r>
+          </w:p>
+        </w:tc>
+        <w:tc>
+          <w:tcPr/>
+          <w:p>
+            <w:pPr>
+              <w:pStyle w:val="Compact"/>
+            </w:pPr>
+            <w:r>
+              <w:rPr>
+                <w:sz w:val="18"/>
+              </w:rPr>
+              <w:t xml:space="preserve">51</w:t>
             </w:r>
           </w:p>
         </w:tc>
@@ -1128,21 +1142,35 @@
               <w:rPr>
                 <w:sz w:val="18"/>
               </w:rPr>
-              <w:t xml:space="preserve">хорошо видна, одиночная</w:t>
-            </w:r>
-          </w:p>
-        </w:tc>
-        <w:tc>
-          <w:tcPr/>
-          <w:p>
-            <w:pPr>
-              <w:pStyle w:val="Compact"/>
-            </w:pPr>
-            <w:r>
-              <w:rPr>
-                <w:sz w:val="18"/>
-              </w:rPr>
-              <w:t xml:space="preserve">0.092 — DBSR + NIST</w:t>
+              <w:t xml:space="preserve">видна, в дублете с 545.045</w:t>
+            </w:r>
+          </w:p>
+        </w:tc>
+        <w:tc>
+          <w:tcPr/>
+          <w:p>
+            <w:pPr>
+              <w:pStyle w:val="Compact"/>
+            </w:pPr>
+            <w:r>
+              <w:rPr>
+                <w:b/>
+                <w:bCs/>
+                <w:sz w:val="18"/>
+              </w:rPr>
+              <w:t xml:space="preserve">0.014 — измерено</w:t>
+            </w:r>
+            <w:r>
+              <w:rPr>
+                <w:sz w:val="18"/>
+              </w:rPr>
+              <w:t xml:space="preserve"> </w:t>
+            </w:r>
+            <w:r>
+              <w:rPr>
+                <w:sz w:val="18"/>
+              </w:rPr>
+              <w:t xml:space="preserve">(DBSR 0.037)</w:t>
             </w:r>
           </w:p>
         </w:tc>
@@ -1160,6 +1188,80 @@
                 <w:bCs/>
                 <w:sz w:val="18"/>
               </w:rPr>
+              <w:t xml:space="preserve">553.107</w:t>
+            </w:r>
+          </w:p>
+        </w:tc>
+        <w:tc>
+          <w:tcPr/>
+          <w:p>
+            <w:pPr>
+              <w:pStyle w:val="Compact"/>
+            </w:pPr>
+            <w:r>
+              <w:rPr>
+                <w:sz w:val="18"/>
+              </w:rPr>
+              <w:t xml:space="preserve">29</w:t>
+            </w:r>
+          </w:p>
+        </w:tc>
+        <w:tc>
+          <w:tcPr/>
+          <w:p>
+            <w:pPr>
+              <w:pStyle w:val="Compact"/>
+            </w:pPr>
+            <w:r>
+              <w:rPr>
+                <w:sz w:val="18"/>
+              </w:rPr>
+              <w:t xml:space="preserve">Te</w:t>
+            </w:r>
+          </w:p>
+        </w:tc>
+        <w:tc>
+          <w:tcPr/>
+          <w:p>
+            <w:pPr>
+              <w:pStyle w:val="Compact"/>
+            </w:pPr>
+            <w:r>
+              <w:rPr>
+                <w:sz w:val="18"/>
+              </w:rPr>
+              <w:t xml:space="preserve">хорошо видна, одиночная</w:t>
+            </w:r>
+          </w:p>
+        </w:tc>
+        <w:tc>
+          <w:tcPr/>
+          <w:p>
+            <w:pPr>
+              <w:pStyle w:val="Compact"/>
+            </w:pPr>
+            <w:r>
+              <w:rPr>
+                <w:sz w:val="18"/>
+              </w:rPr>
+              <w:t xml:space="preserve">0.092 — DBSR + NIST (измерено 0.089)</w:t>
+            </w:r>
+          </w:p>
+        </w:tc>
+      </w:tr>
+      <w:tr>
+        <w:tc>
+          <w:tcPr/>
+          <w:p>
+            <w:pPr>
+              <w:pStyle w:val="Compact"/>
+            </w:pPr>
+            <w:r>
+              <w:rPr>
+                <w:b/>
+                <w:bCs/>
+                <w:sz w:val="18"/>
+              </w:rPr>
               <w:t xml:space="preserve">543.896</w:t>
             </w:r>
           </w:p>
@@ -1214,9 +1316,23 @@
             </w:pPr>
             <w:r>
               <w:rPr>
-                <w:sz w:val="18"/>
-              </w:rPr>
-              <w:t xml:space="preserve">0.45 — DBSR + NIST</w:t>
+                <w:b/>
+                <w:bCs/>
+                <w:sz w:val="18"/>
+              </w:rPr>
+              <w:t xml:space="preserve">0.64 — измерено</w:t>
+            </w:r>
+            <w:r>
+              <w:rPr>
+                <w:sz w:val="18"/>
+              </w:rPr>
+              <w:t xml:space="preserve"> </w:t>
+            </w:r>
+            <w:r>
+              <w:rPr>
+                <w:sz w:val="18"/>
+              </w:rPr>
+              <w:t xml:space="preserve">(DBSR + NIST 0.45)</w:t>
             </w:r>
           </w:p>
         </w:tc>
@@ -1247,19 +1363,35 @@
           <w:b/>
           <w:bCs/>
         </w:rPr>
-        <w:t xml:space="preserve">ne: 561.667 / 557.219</w:t>
-      </w:r>
-      <w:r>
-        <w:t xml:space="preserve"> </w:t>
-      </w:r>
-      <w:r>
-        <w:t xml:space="preserve">— наклоны 10.42 и 10.44 (почти равны), множитель метастабилей</w:t>
-      </w:r>
-      <w:r>
-        <w:t xml:space="preserve"> </w:t>
-      </w:r>
-      <w:r>
-        <w:t xml:space="preserve">3.0·10⁷ против 1.3·10⁷ (×2.3).</w:t>
+        <w:t xml:space="preserve">ne: 561.667 / 545.045</w:t>
+      </w:r>
+      <w:r>
+        <w:t xml:space="preserve"> </w:t>
+      </w:r>
+      <w:r>
+        <w:t xml:space="preserve">— наклоны 10.42 и 10.54 (почти равны), множитель метастабилей</w:t>
+      </w:r>
+      <w:r>
+        <w:t xml:space="preserve"> </w:t>
+      </w:r>
+      <w:r>
+        <w:t xml:space="preserve">3.0·10⁷ против 6.6·10⁶ (</w:t>
+      </w:r>
+      <w:r>
+        <w:rPr>
+          <w:b/>
+          <w:bCs/>
+        </w:rPr>
+        <w:t xml:space="preserve">×4.6</w:t>
+      </w:r>
+      <w:r>
+        <w:t xml:space="preserve">). Обе линии в одном окне 545–562 нм.</w:t>
+      </w:r>
+      <w:r>
+        <w:t xml:space="preserve"> </w:t>
+      </w:r>
+      <w:r>
+        <w:t xml:space="preserve">Запасная — 561.667 / 557.219 (наклоны 10.42 и 10.44, множители ×2.3).</w:t>
       </w:r>
     </w:p>
     <w:p>
@@ -1293,6 +1425,68 @@
     <w:p>
       <w:pPr>
         <w:pStyle w:val="FirstParagraph"/>
+      </w:pPr>
+      <w:r>
+        <w:t xml:space="preserve">Почему 545.045 вернулась: раньше её ветвление брать было неоткуда (расчёт неверен в сотни</w:t>
+      </w:r>
+      <w:r>
+        <w:t xml:space="preserve"> </w:t>
+      </w:r>
+      <w:r>
+        <w:t xml:space="preserve">раз). Теперь оно измерено по спектрам (п. 6.1), а пара с 561.667 даёт вдвое большую</w:t>
+      </w:r>
+      <w:r>
+        <w:t xml:space="preserve"> </w:t>
+      </w:r>
+      <w:r>
+        <w:t xml:space="preserve">чувствительность к ne, чем 561.667 / 557.219.</w:t>
+      </w:r>
+    </w:p>
+    <w:p>
+      <w:pPr>
+        <w:pStyle w:val="BodyText"/>
+      </w:pPr>
+      <w:r>
+        <w:rPr>
+          <w:b/>
+          <w:bCs/>
+        </w:rPr>
+        <w:t xml:space="preserve">Проверена и отклонена: 483.025 (уровень 101, порог 18.4 эВ)</w:t>
+      </w:r>
+      <w:r>
+        <w:t xml:space="preserve"> </w:t>
+      </w:r>
+      <w:r>
+        <w:t xml:space="preserve">— кандидат для Te с большим</w:t>
+      </w:r>
+      <w:r>
+        <w:t xml:space="preserve"> </w:t>
+      </w:r>
+      <w:r>
+        <w:t xml:space="preserve">наклоном (12.7). Ветвление не определить: расчёт предсказывает сильную ветвь 759.46 нм</w:t>
+      </w:r>
+      <w:r>
+        <w:t xml:space="preserve"> </w:t>
+      </w:r>
+      <w:r>
+        <w:t xml:space="preserve">(BR 0.13, в спектре должна быть видна с S/N ~ 500), а её нет (S/N &lt; 5); главная по расчёту</w:t>
+      </w:r>
+      <w:r>
+        <w:t xml:space="preserve"> </w:t>
+      </w:r>
+      <w:r>
+        <w:t xml:space="preserve">ветвь 526.831 в NIST — смесь нескольких переходов. Кроме того, уровень 101 — почти верхний в</w:t>
+      </w:r>
+      <w:r>
+        <w:t xml:space="preserve"> </w:t>
+      </w:r>
+      <w:r>
+        <w:t xml:space="preserve">модели Ванга (18.5 эВ), где сечения наименее надёжны.</w:t>
+      </w:r>
+    </w:p>
+    <w:p>
+      <w:pPr>
+        <w:pStyle w:val="BodyText"/>
       </w:pPr>
       <w:r>
         <w:t xml:space="preserve">Раньше основной Te-партнёр был 543.896, потому что 553.107 в спектре A25 насыщалась. В A3</w:t>
@@ -1646,7 +1840,13 @@
         <w:pStyle w:val="BodyText"/>
       </w:pPr>
       <w:r>
-        <w:t xml:space="preserve">545.045 заменена на 557.219: для уровня 44 расчёт противоречит спектру в сотни раз (п. 6).</w:t>
+        <w:t xml:space="preserve">545.045 одно время была заменена на 557.219 (расчёт A уровня 44 противоречит спектру в сотни</w:t>
+      </w:r>
+      <w:r>
+        <w:t xml:space="preserve"> </w:t>
+      </w:r>
+      <w:r>
+        <w:t xml:space="preserve">раз, п. 6); с измеренным ветвлением (п. 6.1) она возвращена.</w:t>
       </w:r>
     </w:p>
     <w:bookmarkEnd w:id="13"/>
@@ -3029,7 +3229,7 @@
               <w:rPr>
                 <w:sz w:val="18"/>
               </w:rPr>
-              <w:t xml:space="preserve">→ 545.045 исключена</w:t>
+              <w:t xml:space="preserve">→ для 545.045 ветвление измерено (п. 6.1)</w:t>
             </w:r>
           </w:p>
         </w:tc>
@@ -4134,10 +4334,13 @@
           <w:b/>
           <w:bCs/>
         </w:rPr>
-        <w:t xml:space="preserve">линию можно вернуть</w:t>
-      </w:r>
-      <w:r>
-        <w:t xml:space="preserve">.</w:t>
+        <w:t xml:space="preserve">линия возвращена</w:t>
+      </w:r>
+      <w:r>
+        <w:t xml:space="preserve"> </w:t>
+      </w:r>
+      <w:r>
+        <w:t xml:space="preserve">(п. 4).</w:t>
       </w:r>
     </w:p>
     <w:p>
@@ -4175,7 +4378,22 @@
         <w:t xml:space="preserve"> </w:t>
       </w:r>
       <w:r>
-        <w:t xml:space="preserve">— измерение расходится с DBSR в 2.7 и 1.6 раза. У 545.090 большая</w:t>
+        <w:t xml:space="preserve">— измерение расходится с DBSR в 2.7 и 1.6 раза; в ноутбуке 02</w:t>
+      </w:r>
+      <w:r>
+        <w:t xml:space="preserve"> </w:t>
+      </w:r>
+      <w:r>
+        <w:t xml:space="preserve">теперь стоят измеренные значения (</w:t>
+      </w:r>
+      <w:r>
+        <w:rPr>
+          <w:rStyle w:val="VerbatimChar"/>
+        </w:rPr>
+        <w:t xml:space="preserve">nb.XE2_BR_MEASURED</w:t>
+      </w:r>
+      <w:r>
+        <w:t xml:space="preserve">). У 545.090 большая</w:t>
       </w:r>
       <w:r>
         <w:t xml:space="preserve"> </w:t>
@@ -7147,19 +7365,13 @@
         </w:numPr>
       </w:pPr>
       <w:r>
-        <w:t xml:space="preserve">Вернуть 545.045 с измеренным ветвлением (п. 6.1)?</w:t>
-      </w:r>
-    </w:p>
-    <w:p>
-      <w:pPr>
-        <w:pStyle w:val="Compact"/>
-        <w:numPr>
-          <w:ilvl w:val="0"/>
-          <w:numId w:val="1027"/>
-        </w:numPr>
-      </w:pPr>
-      <w:r>
-        <w:t xml:space="preserve">Для 545.090 и 543.896 брать измеренное ветвление вместо DBSR (расхождение 2.7 и 1.6 раза)?</w:t>
+        <w:t xml:space="preserve">557.219 (теперь запасная): измерено 0.027 (0.019–0.028), в ноутбуке 02 стоит 0.018 (DBSR + NIST).</w:t>
+      </w:r>
+      <w:r>
+        <w:t xml:space="preserve"> </w:t>
+      </w:r>
+      <w:r>
+        <w:t xml:space="preserve">Переключить на измеренное, если будете её использовать?</w:t>
       </w:r>
     </w:p>
     <w:p>
@@ -9096,35 +9308,35 @@
               <w:rPr>
                 <w:sz w:val="18"/>
               </w:rPr>
-              <w:t xml:space="preserve">545.045</w:t>
-            </w:r>
-          </w:p>
-        </w:tc>
-        <w:tc>
-          <w:tcPr/>
-          <w:p>
-            <w:pPr>
-              <w:pStyle w:val="Compact"/>
-            </w:pPr>
-            <w:r>
-              <w:rPr>
-                <w:sz w:val="18"/>
-              </w:rPr>
-              <w:t xml:space="preserve">44</w:t>
-            </w:r>
-          </w:p>
-        </w:tc>
-        <w:tc>
-          <w:tcPr/>
-          <w:p>
-            <w:pPr>
-              <w:pStyle w:val="Compact"/>
-            </w:pPr>
-            <w:r>
-              <w:rPr>
-                <w:sz w:val="18"/>
-              </w:rPr>
-              <w:t xml:space="preserve">расчётные A уровня 44 противоречат спектру (575.103/545.045: 3.3 измерено, 2284 расчёт); проверено, что это не путаница уровней</w:t>
+              <w:t xml:space="preserve">483.025</w:t>
+            </w:r>
+          </w:p>
+        </w:tc>
+        <w:tc>
+          <w:tcPr/>
+          <w:p>
+            <w:pPr>
+              <w:pStyle w:val="Compact"/>
+            </w:pPr>
+            <w:r>
+              <w:rPr>
+                <w:sz w:val="18"/>
+              </w:rPr>
+              <w:t xml:space="preserve">101</w:t>
+            </w:r>
+          </w:p>
+        </w:tc>
+        <w:tc>
+          <w:tcPr/>
+          <w:p>
+            <w:pPr>
+              <w:pStyle w:val="Compact"/>
+            </w:pPr>
+            <w:r>
+              <w:rPr>
+                <w:sz w:val="18"/>
+              </w:rPr>
+              <w:t xml:space="preserve">ветвление не определить: расчёт противоречит спектру (759.46 не видна), главная ветвь 526.831 — смесь переходов (п. 4 Части 1)</w:t>
             </w:r>
           </w:p>
         </w:tc>

</xml_diff>

<commit_message>
Notebook 05 tested on a J=0 run; timing and cascade probabilities in lines_final.md
Co-Authored-By: Claude Opus 5.5 <noreply@anthropic.com>
Claude-Session: https://claude.ai/code/session_018nKkrJu4ehWWcEHTugH1GR
</commit_message>
<xml_diff>
--- a/docs/crm/lines_final.docx
+++ b/docs/crm/lines_final.docx
@@ -10446,6 +10446,70 @@
       </w:r>
       <w:r>
         <w:t xml:space="preserve">пределах ×2.</w:t>
+      </w:r>
+    </w:p>
+    <w:p>
+      <w:pPr>
+        <w:pStyle w:val="Compact"/>
+        <w:numPr>
+          <w:ilvl w:val="0"/>
+          <w:numId w:val="1030"/>
+        </w:numPr>
+      </w:pPr>
+      <w:r>
+        <w:rPr>
+          <w:b/>
+          <w:bCs/>
+        </w:rPr>
+        <w:t xml:space="preserve">Xe⁺, рассеяние в модели Ванга (ноутбук 05, проверка J = 0, 2 парциальные волны).</w:t>
+      </w:r>
+      <w:r>
+        <w:t xml:space="preserve"> </w:t>
+      </w:r>
+      <w:r>
+        <w:t xml:space="preserve">Всего</w:t>
+      </w:r>
+      <w:r>
+        <w:t xml:space="preserve"> </w:t>
+      </w:r>
+      <w:r>
+        <w:t xml:space="preserve">3 ч на 4 ядрах: каждая волна (68 каналов, матрица 11 441) — ~65 мин диагонализации</w:t>
+      </w:r>
+      <w:r>
+        <w:t xml:space="preserve"> </w:t>
+      </w:r>
+      <w:r>
+        <w:t xml:space="preserve">(dbsr_hd3 шёл в один поток), внешняя область на 2200 энергиях — 45 мин. Полный расчёт</w:t>
+      </w:r>
+      <w:r>
+        <w:t xml:space="preserve"> </w:t>
+      </w:r>
+      <w:r>
+        <w:t xml:space="preserve">(J ≤ 25, ~50 волн с бо́льшими матрицами) — сервер, порядка суток и больше; проверьте, что</w:t>
+      </w:r>
+      <w:r>
+        <w:t xml:space="preserve"> </w:t>
+      </w:r>
+      <w:r>
+        <w:t xml:space="preserve">диагонализация идёт в несколько потоков. Ноутбук 05 на этих данных прошёл целиком.</w:t>
+      </w:r>
+      <w:r>
+        <w:t xml:space="preserve"> </w:t>
+      </w:r>
+      <w:r>
+        <w:t xml:space="preserve">Уже надёжно (не зависит от J): уровень 29 (553.107) питается каскадами сильнее всех —</w:t>
+      </w:r>
+      <w:r>
+        <w:t xml:space="preserve"> </w:t>
+      </w:r>
+      <w:r>
+        <w:t xml:space="preserve">P = 0.95 с уровня 34 и 0.45 с уровня 38 (5d); у остальных выбранных уровней P ≤ 0.23</w:t>
+      </w:r>
+      <w:r>
+        <w:t xml:space="preserve"> </w:t>
+      </w:r>
+      <w:r>
+        <w:t xml:space="preserve">(41 ← 87, 7s) и ≤ 0.07.</w:t>
       </w:r>
     </w:p>
     <w:p>

</xml_diff>

<commit_message>
Check that the Ba II lines are barium, not xenon (positions, branching, behaviour across spectra)
Co-Authored-By: Claude Opus 5.5 <noreply@anthropic.com>
Claude-Session: https://claude.ai/code/session_018nKkrJu4ehWWcEHTugH1GR
</commit_message>
<xml_diff>
--- a/docs/crm/lines_final.docx
+++ b/docs/crm/lines_final.docx
@@ -10306,14 +10306,22 @@
         </w:tc>
       </w:tr>
     </w:tbl>
-    <w:bookmarkEnd w:id="30"/>
-    <w:bookmarkStart w:id="31" w:name="X6d6f47a680e26386468108ba5d9a370d9572a0e"/>
-    <w:p>
-      <w:pPr>
-        <w:pStyle w:val="Heading2"/>
-      </w:pPr>
-      <w:r>
-        <w:t xml:space="preserve">3. Тестовый прогон (4 ядра)</w:t>
+    <w:p>
+      <w:pPr>
+        <w:pStyle w:val="BodyText"/>
+      </w:pPr>
+      <w:r>
+        <w:rPr>
+          <w:b/>
+          <w:bCs/>
+        </w:rPr>
+        <w:t xml:space="preserve">Проверка, что это барий, а не ксенон</w:t>
+      </w:r>
+      <w:r>
+        <w:t xml:space="preserve"> </w:t>
+      </w:r>
+      <w:r>
+        <w:t xml:space="preserve">(A1, A3, A15, A25):</w:t>
       </w:r>
     </w:p>
     <w:p>
@@ -10325,29 +10333,19 @@
         </w:numPr>
       </w:pPr>
       <w:r>
-        <w:rPr>
-          <w:b/>
-          <w:bCs/>
-        </w:rPr>
-        <w:t xml:space="preserve">Xe⁺, мишень и A.</w:t>
-      </w:r>
-      <w:r>
-        <w:t xml:space="preserve"> </w:t>
-      </w:r>
-      <w:r>
-        <w:t xml:space="preserve">Мишень — 4 мин 40 с; E1-ветви 19 уровней 6p — секунды. Против NIST:</w:t>
-      </w:r>
-      <w:r>
-        <w:t xml:space="preserve"> </w:t>
-      </w:r>
-      <w:r>
-        <w:t xml:space="preserve">21 линия, медиана DBSR/NIST = 1.03, 13 из 21 в пределах ×2. Проверка по спектру A3 — п. 6</w:t>
-      </w:r>
-      <w:r>
-        <w:t xml:space="preserve"> </w:t>
-      </w:r>
-      <w:r>
-        <w:t xml:space="preserve">Части 1.</w:t>
+        <w:t xml:space="preserve">В NIST рядом нет линий Xe, способных их подменить: у 455.403 ближайший Xe — Xe III в 148 пм;</w:t>
+      </w:r>
+      <w:r>
+        <w:t xml:space="preserve"> </w:t>
+      </w:r>
+      <w:r>
+        <w:t xml:space="preserve">у 493.408 — Xe II 493.430 (22 пм, интенсивность 1, переход 4f→7g — не виден); у 614.171 —</w:t>
+      </w:r>
+      <w:r>
+        <w:t xml:space="preserve"> </w:t>
+      </w:r>
+      <w:r>
+        <w:t xml:space="preserve">Xe I 614.213 (42 пм, интенсивность 1).</w:t>
       </w:r>
     </w:p>
     <w:p>
@@ -10359,44 +10357,13 @@
         </w:numPr>
       </w:pPr>
       <w:r>
-        <w:rPr>
-          <w:b/>
-          <w:bCs/>
-        </w:rPr>
-        <w:t xml:space="preserve">Ba II (</w:t>
-      </w:r>
-      <w:r>
-        <w:rPr>
-          <w:rStyle w:val="VerbatimChar"/>
-          <w:b/>
-          <w:bCs/>
-        </w:rPr>
-        <w:t xml:space="preserve">ba2</w:t>
-      </w:r>
-      <w:r>
-        <w:rPr>
-          <w:b/>
-          <w:bCs/>
-        </w:rPr>
-        <w:t xml:space="preserve">).</w:t>
-      </w:r>
-      <w:r>
-        <w:t xml:space="preserve"> </w:t>
-      </w:r>
-      <w:r>
-        <w:t xml:space="preserve">A(DBSR)/A(NIST) = 1.43 (455.403), 1.32 (493.408), 1.27 (614.171), 1.07</w:t>
-      </w:r>
-      <w:r>
-        <w:t xml:space="preserve"> </w:t>
-      </w:r>
-      <w:r>
-        <w:t xml:space="preserve">(585.367), 1.60 (649.690). Времена жизни 5d по E2: 62 с и 28 с. Запись сечений и</w:t>
-      </w:r>
-      <w:r>
-        <w:t xml:space="preserve"> </w:t>
-      </w:r>
-      <w:r>
-        <w:t xml:space="preserve">констант проверена на неполном наборе парциальных волн.</w:t>
+        <w:t xml:space="preserve">Положение пиков после поправки шкалы (гайд, п. 1) совпадает с Ba II в пределах ±8 пм</w:t>
+      </w:r>
+      <w:r>
+        <w:t xml:space="preserve"> </w:t>
+      </w:r>
+      <w:r>
+        <w:t xml:space="preserve">(455.403, 493.408) и +15 пм (614.171).</w:t>
       </w:r>
     </w:p>
     <w:p>
@@ -10408,44 +10375,13 @@
         </w:numPr>
       </w:pPr>
       <w:r>
-        <w:rPr>
-          <w:b/>
-          <w:bCs/>
-        </w:rPr>
-        <w:t xml:space="preserve">Ba I (</w:t>
-      </w:r>
-      <w:r>
-        <w:rPr>
-          <w:rStyle w:val="VerbatimChar"/>
-          <w:b/>
-          <w:bCs/>
-        </w:rPr>
-        <w:t xml:space="preserve">ba1</w:t>
-      </w:r>
-      <w:r>
-        <w:rPr>
-          <w:b/>
-          <w:bCs/>
-        </w:rPr>
-        <w:t xml:space="preserve">).</w:t>
-      </w:r>
-      <w:r>
-        <w:t xml:space="preserve"> </w:t>
-      </w:r>
-      <w:r>
-        <w:t xml:space="preserve">Мишень и A — 2 мин 20 с, 39 из 49 состояний сопоставлены с NIST. Для</w:t>
-      </w:r>
-      <w:r>
-        <w:t xml:space="preserve"> </w:t>
-      </w:r>
-      <w:r>
-        <w:t xml:space="preserve">553.548 A(DBSR)/A(NIST) = 1.11, gf = 1.81 (f = 1.64 по Fursa). По 52 линиям Ba I 25 в</w:t>
-      </w:r>
-      <w:r>
-        <w:t xml:space="preserve"> </w:t>
-      </w:r>
-      <w:r>
-        <w:t xml:space="preserve">пределах ×2.</w:t>
+        <w:t xml:space="preserve">Отношение ветвей одного верхнего уровня 6p ²P₃/₂: 614.171/455.403 = 0.39 по фотонам (A3,</w:t>
+      </w:r>
+      <w:r>
+        <w:t xml:space="preserve"> </w:t>
+      </w:r>
+      <w:r>
+        <w:t xml:space="preserve">data5 и data10), по A из NIST 0.371.</w:t>
       </w:r>
     </w:p>
     <w:p>
@@ -10457,59 +10393,25 @@
         </w:numPr>
       </w:pPr>
       <w:r>
-        <w:rPr>
-          <w:b/>
-          <w:bCs/>
-        </w:rPr>
-        <w:t xml:space="preserve">Xe⁺, рассеяние в модели Ванга (ноутбук 05, проверка J = 0, 2 парциальные волны).</w:t>
-      </w:r>
-      <w:r>
-        <w:t xml:space="preserve"> </w:t>
-      </w:r>
-      <w:r>
-        <w:t xml:space="preserve">Всего</w:t>
-      </w:r>
-      <w:r>
-        <w:t xml:space="preserve"> </w:t>
-      </w:r>
-      <w:r>
-        <w:t xml:space="preserve">3 ч на 4 ядрах: каждая волна (68 каналов, матрица 11 441) — ~65 мин диагонализации</w:t>
-      </w:r>
-      <w:r>
-        <w:t xml:space="preserve"> </w:t>
-      </w:r>
-      <w:r>
-        <w:t xml:space="preserve">(dbsr_hd3 шёл в один поток), внешняя область на 2200 энергиях — 45 мин. Полный расчёт</w:t>
-      </w:r>
-      <w:r>
-        <w:t xml:space="preserve"> </w:t>
-      </w:r>
-      <w:r>
-        <w:t xml:space="preserve">(J ≤ 25, ~50 волн с бо́льшими матрицами) — сервер, порядка суток и больше; проверьте, что</w:t>
-      </w:r>
-      <w:r>
-        <w:t xml:space="preserve"> </w:t>
-      </w:r>
-      <w:r>
-        <w:t xml:space="preserve">диагонализация идёт в несколько потоков. Ноутбук 05 на этих данных прошёл целиком.</w:t>
-      </w:r>
-      <w:r>
-        <w:t xml:space="preserve"> </w:t>
-      </w:r>
-      <w:r>
-        <w:t xml:space="preserve">Уже надёжно (не зависит от J): уровень 29 (553.107) питается каскадами сильнее всех —</w:t>
-      </w:r>
-      <w:r>
-        <w:t xml:space="preserve"> </w:t>
-      </w:r>
-      <w:r>
-        <w:t xml:space="preserve">P = 0.95 с уровня 34 и 0.45 с уровня 38 (5d); у остальных выбранных уровней P ≤ 0.23</w:t>
-      </w:r>
-      <w:r>
-        <w:t xml:space="preserve"> </w:t>
-      </w:r>
-      <w:r>
-        <w:t xml:space="preserve">(41 ← 87, 7s) и ≤ 0.07.</w:t>
+        <w:t xml:space="preserve">Барий и ксенон меняются независимо. Пик 455.403: 56 отсчётов (A25, data1), 154 (A1),</w:t>
+      </w:r>
+      <w:r>
+        <w:t xml:space="preserve"> </w:t>
+      </w:r>
+      <w:r>
+        <w:t xml:space="preserve">11 900 (A3), насыщение (A25, data3_hot — горячий катод), т. е. в тысячу раз. Линии Xe II</w:t>
+      </w:r>
+      <w:r>
+        <w:t xml:space="preserve"> </w:t>
+      </w:r>
+      <w:r>
+        <w:t xml:space="preserve">(537.239, 605.115) между этими спектрами меняются в 1–3 раза. Ba I 553.548 ведёт себя так</w:t>
+      </w:r>
+      <w:r>
+        <w:t xml:space="preserve"> </w:t>
+      </w:r>
+      <w:r>
+        <w:t xml:space="preserve">же, как Ba II. Линия Xe так себя вести не может.</w:t>
       </w:r>
     </w:p>
     <w:p>
@@ -10518,6 +10420,252 @@
         <w:numPr>
           <w:ilvl w:val="0"/>
           <w:numId w:val="1030"/>
+        </w:numPr>
+      </w:pPr>
+      <w:r>
+        <w:rPr>
+          <w:b/>
+          <w:bCs/>
+        </w:rPr>
+        <w:t xml:space="preserve">Исключение — 649.690:</w:t>
+      </w:r>
+      <w:r>
+        <w:t xml:space="preserve"> </w:t>
+      </w:r>
+      <w:r>
+        <w:t xml:space="preserve">в 53 пм от неё Xe I 649.743 (интенсивность 30). В спектрах, где</w:t>
+      </w:r>
+      <w:r>
+        <w:t xml:space="preserve"> </w:t>
+      </w:r>
+      <w:r>
+        <w:t xml:space="preserve">бария мало (A1, A15, A25), пик на 649.7 в 2–10 раз сильнее, чем 493.408, хотя у Ba II должно</w:t>
+      </w:r>
+      <w:r>
+        <w:t xml:space="preserve"> </w:t>
+      </w:r>
+      <w:r>
+        <w:t xml:space="preserve">быть 0.33 от неё: это Xe I. В A3 отношение 649.690/493.408 = 0.45 вместо 0.33 — тоже с</w:t>
+      </w:r>
+      <w:r>
+        <w:t xml:space="preserve"> </w:t>
+      </w:r>
+      <w:r>
+        <w:t xml:space="preserve">примесью Xe I. Для бария 649.690 не использовать.</w:t>
+      </w:r>
+    </w:p>
+    <w:bookmarkEnd w:id="30"/>
+    <w:bookmarkStart w:id="31" w:name="X6d6f47a680e26386468108ba5d9a370d9572a0e"/>
+    <w:p>
+      <w:pPr>
+        <w:pStyle w:val="Heading2"/>
+      </w:pPr>
+      <w:r>
+        <w:t xml:space="preserve">3. Тестовый прогон (4 ядра)</w:t>
+      </w:r>
+    </w:p>
+    <w:p>
+      <w:pPr>
+        <w:pStyle w:val="Compact"/>
+        <w:numPr>
+          <w:ilvl w:val="0"/>
+          <w:numId w:val="1031"/>
+        </w:numPr>
+      </w:pPr>
+      <w:r>
+        <w:rPr>
+          <w:b/>
+          <w:bCs/>
+        </w:rPr>
+        <w:t xml:space="preserve">Xe⁺, мишень и A.</w:t>
+      </w:r>
+      <w:r>
+        <w:t xml:space="preserve"> </w:t>
+      </w:r>
+      <w:r>
+        <w:t xml:space="preserve">Мишень — 4 мин 40 с; E1-ветви 19 уровней 6p — секунды. Против NIST:</w:t>
+      </w:r>
+      <w:r>
+        <w:t xml:space="preserve"> </w:t>
+      </w:r>
+      <w:r>
+        <w:t xml:space="preserve">21 линия, медиана DBSR/NIST = 1.03, 13 из 21 в пределах ×2. Проверка по спектру A3 — п. 6</w:t>
+      </w:r>
+      <w:r>
+        <w:t xml:space="preserve"> </w:t>
+      </w:r>
+      <w:r>
+        <w:t xml:space="preserve">Части 1.</w:t>
+      </w:r>
+    </w:p>
+    <w:p>
+      <w:pPr>
+        <w:pStyle w:val="Compact"/>
+        <w:numPr>
+          <w:ilvl w:val="0"/>
+          <w:numId w:val="1031"/>
+        </w:numPr>
+      </w:pPr>
+      <w:r>
+        <w:rPr>
+          <w:b/>
+          <w:bCs/>
+        </w:rPr>
+        <w:t xml:space="preserve">Ba II (</w:t>
+      </w:r>
+      <w:r>
+        <w:rPr>
+          <w:rStyle w:val="VerbatimChar"/>
+          <w:b/>
+          <w:bCs/>
+        </w:rPr>
+        <w:t xml:space="preserve">ba2</w:t>
+      </w:r>
+      <w:r>
+        <w:rPr>
+          <w:b/>
+          <w:bCs/>
+        </w:rPr>
+        <w:t xml:space="preserve">).</w:t>
+      </w:r>
+      <w:r>
+        <w:t xml:space="preserve"> </w:t>
+      </w:r>
+      <w:r>
+        <w:t xml:space="preserve">A(DBSR)/A(NIST) = 1.43 (455.403), 1.32 (493.408), 1.27 (614.171), 1.07</w:t>
+      </w:r>
+      <w:r>
+        <w:t xml:space="preserve"> </w:t>
+      </w:r>
+      <w:r>
+        <w:t xml:space="preserve">(585.367), 1.60 (649.690). Времена жизни 5d по E2: 62 с и 28 с. Запись сечений и</w:t>
+      </w:r>
+      <w:r>
+        <w:t xml:space="preserve"> </w:t>
+      </w:r>
+      <w:r>
+        <w:t xml:space="preserve">констант проверена на неполном наборе парциальных волн.</w:t>
+      </w:r>
+    </w:p>
+    <w:p>
+      <w:pPr>
+        <w:pStyle w:val="Compact"/>
+        <w:numPr>
+          <w:ilvl w:val="0"/>
+          <w:numId w:val="1031"/>
+        </w:numPr>
+      </w:pPr>
+      <w:r>
+        <w:rPr>
+          <w:b/>
+          <w:bCs/>
+        </w:rPr>
+        <w:t xml:space="preserve">Ba I (</w:t>
+      </w:r>
+      <w:r>
+        <w:rPr>
+          <w:rStyle w:val="VerbatimChar"/>
+          <w:b/>
+          <w:bCs/>
+        </w:rPr>
+        <w:t xml:space="preserve">ba1</w:t>
+      </w:r>
+      <w:r>
+        <w:rPr>
+          <w:b/>
+          <w:bCs/>
+        </w:rPr>
+        <w:t xml:space="preserve">).</w:t>
+      </w:r>
+      <w:r>
+        <w:t xml:space="preserve"> </w:t>
+      </w:r>
+      <w:r>
+        <w:t xml:space="preserve">Мишень и A — 2 мин 20 с, 39 из 49 состояний сопоставлены с NIST. Для</w:t>
+      </w:r>
+      <w:r>
+        <w:t xml:space="preserve"> </w:t>
+      </w:r>
+      <w:r>
+        <w:t xml:space="preserve">553.548 A(DBSR)/A(NIST) = 1.11, gf = 1.81 (f = 1.64 по Fursa). По 52 линиям Ba I 25 в</w:t>
+      </w:r>
+      <w:r>
+        <w:t xml:space="preserve"> </w:t>
+      </w:r>
+      <w:r>
+        <w:t xml:space="preserve">пределах ×2.</w:t>
+      </w:r>
+    </w:p>
+    <w:p>
+      <w:pPr>
+        <w:pStyle w:val="Compact"/>
+        <w:numPr>
+          <w:ilvl w:val="0"/>
+          <w:numId w:val="1031"/>
+        </w:numPr>
+      </w:pPr>
+      <w:r>
+        <w:rPr>
+          <w:b/>
+          <w:bCs/>
+        </w:rPr>
+        <w:t xml:space="preserve">Xe⁺, рассеяние в модели Ванга (ноутбук 05, проверка J = 0, 2 парциальные волны).</w:t>
+      </w:r>
+      <w:r>
+        <w:t xml:space="preserve"> </w:t>
+      </w:r>
+      <w:r>
+        <w:t xml:space="preserve">Всего</w:t>
+      </w:r>
+      <w:r>
+        <w:t xml:space="preserve"> </w:t>
+      </w:r>
+      <w:r>
+        <w:t xml:space="preserve">3 ч на 4 ядрах: каждая волна (68 каналов, матрица 11 441) — ~65 мин диагонализации</w:t>
+      </w:r>
+      <w:r>
+        <w:t xml:space="preserve"> </w:t>
+      </w:r>
+      <w:r>
+        <w:t xml:space="preserve">(dbsr_hd3 шёл в один поток), внешняя область на 2200 энергиях — 45 мин. Полный расчёт</w:t>
+      </w:r>
+      <w:r>
+        <w:t xml:space="preserve"> </w:t>
+      </w:r>
+      <w:r>
+        <w:t xml:space="preserve">(J ≤ 25, ~50 волн с бо́льшими матрицами) — сервер, порядка суток и больше; проверьте, что</w:t>
+      </w:r>
+      <w:r>
+        <w:t xml:space="preserve"> </w:t>
+      </w:r>
+      <w:r>
+        <w:t xml:space="preserve">диагонализация идёт в несколько потоков. Ноутбук 05 на этих данных прошёл целиком.</w:t>
+      </w:r>
+      <w:r>
+        <w:t xml:space="preserve"> </w:t>
+      </w:r>
+      <w:r>
+        <w:t xml:space="preserve">Уже надёжно (не зависит от J): уровень 29 (553.107) питается каскадами сильнее всех —</w:t>
+      </w:r>
+      <w:r>
+        <w:t xml:space="preserve"> </w:t>
+      </w:r>
+      <w:r>
+        <w:t xml:space="preserve">P = 0.95 с уровня 34 и 0.45 с уровня 38 (5d); у остальных выбранных уровней P ≤ 0.23</w:t>
+      </w:r>
+      <w:r>
+        <w:t xml:space="preserve"> </w:t>
+      </w:r>
+      <w:r>
+        <w:t xml:space="preserve">(41 ← 87, 7s) и ≤ 0.07.</w:t>
+      </w:r>
+    </w:p>
+    <w:p>
+      <w:pPr>
+        <w:pStyle w:val="Compact"/>
+        <w:numPr>
+          <w:ilvl w:val="0"/>
+          <w:numId w:val="1031"/>
         </w:numPr>
       </w:pPr>
       <w:r>
@@ -12082,6 +12230,9 @@
     <w:abstractNumId w:val="991"/>
   </w:num>
   <w:num w:numId="1030">
+    <w:abstractNumId w:val="991"/>
+  </w:num>
+  <w:num w:numId="1031">
     <w:abstractNumId w:val="991"/>
   </w:num>
 </w:numbering>

</xml_diff>

<commit_message>
Check neighbours of the selected lines for Sr, Mn, Cr, Fe (Sr I 545.084 next to 545.090: < 1 % in A3)
Co-Authored-By: Claude Opus 5.5 <noreply@anthropic.com>
Claude-Session: https://claude.ai/code/session_018nKkrJu4ehWWcEHTugH1GR
</commit_message>
<xml_diff>
--- a/docs/crm/lines_final.docx
+++ b/docs/crm/lines_final.docx
@@ -11239,17 +11239,13 @@
         <w:t xml:space="preserve"> </w:t>
       </w:r>
       <w:r>
-        <w:t xml:space="preserve">Xe II и Ba это не влияет (их соседи проверены по всем этим элементам: W, Ca, Al, Sr).</w:t>
-      </w:r>
-    </w:p>
-    <w:bookmarkEnd w:id="31"/>
-    <w:bookmarkStart w:id="32" w:name="X6d6f47a680e26386468108ba5d9a370d9572a0e"/>
-    <w:p>
-      <w:pPr>
-        <w:pStyle w:val="Heading2"/>
-      </w:pPr>
-      <w:r>
-        <w:t xml:space="preserve">3. Тестовый прогон (4 ядра)</w:t>
+        <w:t xml:space="preserve">Xe II и Ba это почти не влияет. Соседи выбранных линий проверены по NIST для W, Ca, Al, Sr,</w:t>
+      </w:r>
+      <w:r>
+        <w:t xml:space="preserve"> </w:t>
+      </w:r>
+      <w:r>
+        <w:t xml:space="preserve">Mn, Cr, Fe (±1.5 FWHM):</w:t>
       </w:r>
     </w:p>
     <w:p>
@@ -11265,25 +11261,37 @@
           <w:b/>
           <w:bCs/>
         </w:rPr>
-        <w:t xml:space="preserve">Xe⁺, мишень и A.</w:t>
-      </w:r>
-      <w:r>
-        <w:t xml:space="preserve"> </w:t>
-      </w:r>
-      <w:r>
-        <w:t xml:space="preserve">Мишень — 4 мин 40 с; E1-ветви 19 уровней 6p — секунды. Против NIST:</w:t>
-      </w:r>
-      <w:r>
-        <w:t xml:space="preserve"> </w:t>
-      </w:r>
-      <w:r>
-        <w:t xml:space="preserve">21 линия, медиана DBSR/NIST = 1.03, 13 из 21 в пределах ×2. Проверка по спектру A3 — п. 6</w:t>
-      </w:r>
-      <w:r>
-        <w:t xml:space="preserve"> </w:t>
-      </w:r>
-      <w:r>
-        <w:t xml:space="preserve">Части 1.</w:t>
+        <w:t xml:space="preserve">545.090 ← Sr I 545.084</w:t>
+      </w:r>
+      <w:r>
+        <w:t xml:space="preserve"> </w:t>
+      </w:r>
+      <w:r>
+        <w:t xml:space="preserve">(6 пм, интенсивность 1000) — единственный реальный кандидат.</w:t>
+      </w:r>
+      <w:r>
+        <w:t xml:space="preserve"> </w:t>
+      </w:r>
+      <w:r>
+        <w:t xml:space="preserve">Сильнейшая линия Sr I (резонансная 460.733, интенсивность 29 000) в A3 — не больше 70</w:t>
+      </w:r>
+      <w:r>
+        <w:t xml:space="preserve"> </w:t>
+      </w:r>
+      <w:r>
+        <w:t xml:space="preserve">отсчётов (и то не чистый пик), значит Sr I 545.084 ≤ 1.3 отсчёта при 545.090 ≈ 170</w:t>
+      </w:r>
+      <w:r>
+        <w:t xml:space="preserve"> </w:t>
+      </w:r>
+      <w:r>
+        <w:t xml:space="preserve">(data10): &lt; 1 %, даже с запасом ×10 на неточность интенсивностей NIST — &lt; 10 %. В спектрах</w:t>
+      </w:r>
+      <w:r>
+        <w:t xml:space="preserve"> </w:t>
+      </w:r>
+      <w:r>
+        <w:t xml:space="preserve">с горячим катодом Sr сильнее — там проверяйте заново.</w:t>
       </w:r>
     </w:p>
     <w:p>
@@ -11295,44 +11303,19 @@
         </w:numPr>
       </w:pPr>
       <w:r>
-        <w:rPr>
-          <w:b/>
-          <w:bCs/>
-        </w:rPr>
-        <w:t xml:space="preserve">Ba II (</w:t>
-      </w:r>
-      <w:r>
-        <w:rPr>
-          <w:rStyle w:val="VerbatimChar"/>
-          <w:b/>
-          <w:bCs/>
-        </w:rPr>
-        <w:t xml:space="preserve">ba2</w:t>
-      </w:r>
-      <w:r>
-        <w:rPr>
-          <w:b/>
-          <w:bCs/>
-        </w:rPr>
-        <w:t xml:space="preserve">).</w:t>
-      </w:r>
-      <w:r>
-        <w:t xml:space="preserve"> </w:t>
-      </w:r>
-      <w:r>
-        <w:t xml:space="preserve">A(DBSR)/A(NIST) = 1.43 (455.403), 1.32 (493.408), 1.27 (614.171), 1.07</w:t>
-      </w:r>
-      <w:r>
-        <w:t xml:space="preserve"> </w:t>
-      </w:r>
-      <w:r>
-        <w:t xml:space="preserve">(585.367), 1.60 (649.690). Времена жизни 5d по E2: 62 с и 28 с. Запись сечений и</w:t>
-      </w:r>
-      <w:r>
-        <w:t xml:space="preserve"> </w:t>
-      </w:r>
-      <w:r>
-        <w:t xml:space="preserve">констант проверена на неполном наборе парциальных волн.</w:t>
+        <w:t xml:space="preserve">493.408 ← Fe I 493.400 (1820), 553.548 ← Fe I 553.542 (1260), 455.403 ← Cr I 455.395 (18):</w:t>
+      </w:r>
+      <w:r>
+        <w:t xml:space="preserve"> </w:t>
+      </w:r>
+      <w:r>
+        <w:t xml:space="preserve">в сотни–тысячи раз слабее сильнейших линий Fe I и Cr I, которые в A3 едва видны (S/N 3–6) —</w:t>
+      </w:r>
+      <w:r>
+        <w:t xml:space="preserve"> </w:t>
+      </w:r>
+      <w:r>
+        <w:t xml:space="preserve">вклад пренебрежим.</w:t>
       </w:r>
     </w:p>
     <w:p>
@@ -11344,11 +11327,67 @@
         </w:numPr>
       </w:pPr>
       <w:r>
+        <w:t xml:space="preserve">543.896, 557.219, 561.667 — соседей нет; 545.045 — Fe II 545.009 (36 пм, Fe II не виден).</w:t>
+      </w:r>
+    </w:p>
+    <w:bookmarkEnd w:id="31"/>
+    <w:bookmarkStart w:id="32" w:name="X6d6f47a680e26386468108ba5d9a370d9572a0e"/>
+    <w:p>
+      <w:pPr>
+        <w:pStyle w:val="Heading2"/>
+      </w:pPr>
+      <w:r>
+        <w:t xml:space="preserve">3. Тестовый прогон (4 ядра)</w:t>
+      </w:r>
+    </w:p>
+    <w:p>
+      <w:pPr>
+        <w:pStyle w:val="Compact"/>
+        <w:numPr>
+          <w:ilvl w:val="0"/>
+          <w:numId w:val="1035"/>
+        </w:numPr>
+      </w:pPr>
+      <w:r>
         <w:rPr>
           <w:b/>
           <w:bCs/>
         </w:rPr>
-        <w:t xml:space="preserve">Ba I (</w:t>
+        <w:t xml:space="preserve">Xe⁺, мишень и A.</w:t>
+      </w:r>
+      <w:r>
+        <w:t xml:space="preserve"> </w:t>
+      </w:r>
+      <w:r>
+        <w:t xml:space="preserve">Мишень — 4 мин 40 с; E1-ветви 19 уровней 6p — секунды. Против NIST:</w:t>
+      </w:r>
+      <w:r>
+        <w:t xml:space="preserve"> </w:t>
+      </w:r>
+      <w:r>
+        <w:t xml:space="preserve">21 линия, медиана DBSR/NIST = 1.03, 13 из 21 в пределах ×2. Проверка по спектру A3 — п. 6</w:t>
+      </w:r>
+      <w:r>
+        <w:t xml:space="preserve"> </w:t>
+      </w:r>
+      <w:r>
+        <w:t xml:space="preserve">Части 1.</w:t>
+      </w:r>
+    </w:p>
+    <w:p>
+      <w:pPr>
+        <w:pStyle w:val="Compact"/>
+        <w:numPr>
+          <w:ilvl w:val="0"/>
+          <w:numId w:val="1035"/>
+        </w:numPr>
+      </w:pPr>
+      <w:r>
+        <w:rPr>
+          <w:b/>
+          <w:bCs/>
+        </w:rPr>
+        <w:t xml:space="preserve">Ba II (</w:t>
       </w:r>
       <w:r>
         <w:rPr>
@@ -11356,7 +11395,7 @@
           <w:b/>
           <w:bCs/>
         </w:rPr>
-        <w:t xml:space="preserve">ba1</w:t>
+        <w:t xml:space="preserve">ba2</w:t>
       </w:r>
       <w:r>
         <w:rPr>
@@ -11369,19 +11408,19 @@
         <w:t xml:space="preserve"> </w:t>
       </w:r>
       <w:r>
-        <w:t xml:space="preserve">Мишень и A — 2 мин 20 с, 39 из 49 состояний сопоставлены с NIST. Для</w:t>
-      </w:r>
-      <w:r>
-        <w:t xml:space="preserve"> </w:t>
-      </w:r>
-      <w:r>
-        <w:t xml:space="preserve">553.548 A(DBSR)/A(NIST) = 1.11, gf = 1.81 (f = 1.64 по Fursa). По 52 линиям Ba I 25 в</w:t>
-      </w:r>
-      <w:r>
-        <w:t xml:space="preserve"> </w:t>
-      </w:r>
-      <w:r>
-        <w:t xml:space="preserve">пределах ×2.</w:t>
+        <w:t xml:space="preserve">A(DBSR)/A(NIST) = 1.43 (455.403), 1.32 (493.408), 1.27 (614.171), 1.07</w:t>
+      </w:r>
+      <w:r>
+        <w:t xml:space="preserve"> </w:t>
+      </w:r>
+      <w:r>
+        <w:t xml:space="preserve">(585.367), 1.60 (649.690). Времена жизни 5d по E2: 62 с и 28 с. Запись сечений и</w:t>
+      </w:r>
+      <w:r>
+        <w:t xml:space="preserve"> </w:t>
+      </w:r>
+      <w:r>
+        <w:t xml:space="preserve">констант проверена на неполном наборе парциальных волн.</w:t>
       </w:r>
     </w:p>
     <w:p>
@@ -11389,7 +11428,7 @@
         <w:pStyle w:val="Compact"/>
         <w:numPr>
           <w:ilvl w:val="0"/>
-          <w:numId w:val="1034"/>
+          <w:numId w:val="1035"/>
         </w:numPr>
       </w:pPr>
       <w:r>
@@ -11397,55 +11436,40 @@
           <w:b/>
           <w:bCs/>
         </w:rPr>
-        <w:t xml:space="preserve">Xe⁺, рассеяние в модели Ванга (ноутбук 05, проверка J = 0, 2 парциальные волны).</w:t>
-      </w:r>
-      <w:r>
-        <w:t xml:space="preserve"> </w:t>
-      </w:r>
-      <w:r>
-        <w:t xml:space="preserve">Всего</w:t>
-      </w:r>
-      <w:r>
-        <w:t xml:space="preserve"> </w:t>
-      </w:r>
-      <w:r>
-        <w:t xml:space="preserve">3 ч на 4 ядрах: каждая волна (68 каналов, матрица 11 441) — ~65 мин диагонализации</w:t>
-      </w:r>
-      <w:r>
-        <w:t xml:space="preserve"> </w:t>
-      </w:r>
-      <w:r>
-        <w:t xml:space="preserve">(dbsr_hd3 шёл в один поток), внешняя область на 2200 энергиях — 45 мин. Полный расчёт</w:t>
-      </w:r>
-      <w:r>
-        <w:t xml:space="preserve"> </w:t>
-      </w:r>
-      <w:r>
-        <w:t xml:space="preserve">(J ≤ 25, ~50 волн с бо́льшими матрицами) — сервер, порядка суток и больше; проверьте, что</w:t>
-      </w:r>
-      <w:r>
-        <w:t xml:space="preserve"> </w:t>
-      </w:r>
-      <w:r>
-        <w:t xml:space="preserve">диагонализация идёт в несколько потоков. Ноутбук 05 на этих данных прошёл целиком.</w:t>
-      </w:r>
-      <w:r>
-        <w:t xml:space="preserve"> </w:t>
-      </w:r>
-      <w:r>
-        <w:t xml:space="preserve">Уже надёжно (не зависит от J): уровень 29 (553.107) питается каскадами сильнее всех —</w:t>
-      </w:r>
-      <w:r>
-        <w:t xml:space="preserve"> </w:t>
-      </w:r>
-      <w:r>
-        <w:t xml:space="preserve">P = 0.95 с уровня 34 и 0.45 с уровня 38 (5d); у остальных выбранных уровней P ≤ 0.23</w:t>
-      </w:r>
-      <w:r>
-        <w:t xml:space="preserve"> </w:t>
-      </w:r>
-      <w:r>
-        <w:t xml:space="preserve">(41 ← 87, 7s) и ≤ 0.07.</w:t>
+        <w:t xml:space="preserve">Ba I (</w:t>
+      </w:r>
+      <w:r>
+        <w:rPr>
+          <w:rStyle w:val="VerbatimChar"/>
+          <w:b/>
+          <w:bCs/>
+        </w:rPr>
+        <w:t xml:space="preserve">ba1</w:t>
+      </w:r>
+      <w:r>
+        <w:rPr>
+          <w:b/>
+          <w:bCs/>
+        </w:rPr>
+        <w:t xml:space="preserve">).</w:t>
+      </w:r>
+      <w:r>
+        <w:t xml:space="preserve"> </w:t>
+      </w:r>
+      <w:r>
+        <w:t xml:space="preserve">Мишень и A — 2 мин 20 с, 39 из 49 состояний сопоставлены с NIST. Для</w:t>
+      </w:r>
+      <w:r>
+        <w:t xml:space="preserve"> </w:t>
+      </w:r>
+      <w:r>
+        <w:t xml:space="preserve">553.548 A(DBSR)/A(NIST) = 1.11, gf = 1.81 (f = 1.64 по Fursa). По 52 линиям Ba I 25 в</w:t>
+      </w:r>
+      <w:r>
+        <w:t xml:space="preserve"> </w:t>
+      </w:r>
+      <w:r>
+        <w:t xml:space="preserve">пределах ×2.</w:t>
       </w:r>
     </w:p>
     <w:p>
@@ -11453,7 +11477,71 @@
         <w:pStyle w:val="Compact"/>
         <w:numPr>
           <w:ilvl w:val="0"/>
-          <w:numId w:val="1034"/>
+          <w:numId w:val="1035"/>
+        </w:numPr>
+      </w:pPr>
+      <w:r>
+        <w:rPr>
+          <w:b/>
+          <w:bCs/>
+        </w:rPr>
+        <w:t xml:space="preserve">Xe⁺, рассеяние в модели Ванга (ноутбук 05, проверка J = 0, 2 парциальные волны).</w:t>
+      </w:r>
+      <w:r>
+        <w:t xml:space="preserve"> </w:t>
+      </w:r>
+      <w:r>
+        <w:t xml:space="preserve">Всего</w:t>
+      </w:r>
+      <w:r>
+        <w:t xml:space="preserve"> </w:t>
+      </w:r>
+      <w:r>
+        <w:t xml:space="preserve">3 ч на 4 ядрах: каждая волна (68 каналов, матрица 11 441) — ~65 мин диагонализации</w:t>
+      </w:r>
+      <w:r>
+        <w:t xml:space="preserve"> </w:t>
+      </w:r>
+      <w:r>
+        <w:t xml:space="preserve">(dbsr_hd3 шёл в один поток), внешняя область на 2200 энергиях — 45 мин. Полный расчёт</w:t>
+      </w:r>
+      <w:r>
+        <w:t xml:space="preserve"> </w:t>
+      </w:r>
+      <w:r>
+        <w:t xml:space="preserve">(J ≤ 25, ~50 волн с бо́льшими матрицами) — сервер, порядка суток и больше; проверьте, что</w:t>
+      </w:r>
+      <w:r>
+        <w:t xml:space="preserve"> </w:t>
+      </w:r>
+      <w:r>
+        <w:t xml:space="preserve">диагонализация идёт в несколько потоков. Ноутбук 05 на этих данных прошёл целиком.</w:t>
+      </w:r>
+      <w:r>
+        <w:t xml:space="preserve"> </w:t>
+      </w:r>
+      <w:r>
+        <w:t xml:space="preserve">Уже надёжно (не зависит от J): уровень 29 (553.107) питается каскадами сильнее всех —</w:t>
+      </w:r>
+      <w:r>
+        <w:t xml:space="preserve"> </w:t>
+      </w:r>
+      <w:r>
+        <w:t xml:space="preserve">P = 0.95 с уровня 34 и 0.45 с уровня 38 (5d); у остальных выбранных уровней P ≤ 0.23</w:t>
+      </w:r>
+      <w:r>
+        <w:t xml:space="preserve"> </w:t>
+      </w:r>
+      <w:r>
+        <w:t xml:space="preserve">(41 ← 87, 7s) и ≤ 0.07.</w:t>
+      </w:r>
+    </w:p>
+    <w:p>
+      <w:pPr>
+        <w:pStyle w:val="Compact"/>
+        <w:numPr>
+          <w:ilvl w:val="0"/>
+          <w:numId w:val="1035"/>
         </w:numPr>
       </w:pPr>
       <w:r>
@@ -13057,6 +13145,9 @@
     <w:abstractNumId w:val="991"/>
   </w:num>
   <w:num w:numId="1034">
+    <w:abstractNumId w:val="991"/>
+  </w:num>
+  <w:num w:numId="1035">
     <w:abstractNumId w:val="991"/>
   </w:num>
 </w:numbering>

</xml_diff>

<commit_message>
Tungsten: local wavelength check, hot-minus-cold Boltzmann test, stacked A3 sheets
Co-Authored-By: Claude Opus 5.5 <noreply@anthropic.com>
Claude-Session: https://claude.ai/code/session_018nKkrJu4ehWWcEHTugH1GR
</commit_message>
<xml_diff>
--- a/docs/crm/lines_final.docx
+++ b/docs/crm/lines_final.docx
@@ -10602,31 +10602,19 @@
           <w:b/>
           <w:bCs/>
         </w:rPr>
-        <w:t xml:space="preserve">В разряде без нагрева катода (A1, A3, A15, A25 data1/data2) вольфрама нет.</w:t>
-      </w:r>
-      <w:r>
-        <w:t xml:space="preserve"> </w:t>
-      </w:r>
-      <w:r>
-        <w:t xml:space="preserve">Доля</w:t>
-      </w:r>
-      <w:r>
-        <w:t xml:space="preserve"> </w:t>
-      </w:r>
-      <w:r>
-        <w:t xml:space="preserve">«найденных» линий W (2–4 %) не отличается от контроля (1–3 %); сильнейшие W I 429.461,</w:t>
-      </w:r>
-      <w:r>
-        <w:t xml:space="preserve"> </w:t>
-      </w:r>
-      <w:r>
-        <w:t xml:space="preserve">407.436 — S/N &lt; 3 (в A3 у 407.436 S/N 5, но ширина 14 пм — шум). Верхняя граница —</w:t>
-      </w:r>
-      <w:r>
-        <w:t xml:space="preserve"> </w:t>
-      </w:r>
-      <w:r>
-        <w:t xml:space="preserve">S/N ≈ 3 для 407.436 / 429.461.</w:t>
+        <w:t xml:space="preserve">Одиночные листы разряда (A1, A3, A15, A25 data1/data2):</w:t>
+      </w:r>
+      <w:r>
+        <w:t xml:space="preserve"> </w:t>
+      </w:r>
+      <w:r>
+        <w:t xml:space="preserve">вольфрам не виден. Доля</w:t>
+      </w:r>
+      <w:r>
+        <w:t xml:space="preserve"> </w:t>
+      </w:r>
+      <w:r>
+        <w:t xml:space="preserve">«найденных» линий W (2–4 %) не отличается от контроля (1–3 %); W I 407.436, 429.461 — S/N &lt; 3.</w:t>
       </w:r>
     </w:p>
     <w:p>
@@ -10642,7 +10630,7 @@
           <w:b/>
           <w:bCs/>
         </w:rPr>
-        <w:t xml:space="preserve">В листе</w:t>
+        <w:t xml:space="preserve">Лист</w:t>
       </w:r>
       <w:r>
         <w:rPr>
@@ -10671,7 +10659,13 @@
           <w:b/>
           <w:bCs/>
         </w:rPr>
-        <w:t xml:space="preserve">(A25, горячий катод) W I, по всей видимости, есть, но слабый:</w:t>
+        <w:t xml:space="preserve">(A25, горячий катод):</w:t>
+      </w:r>
+      <w:r>
+        <w:t xml:space="preserve"> </w:t>
+      </w:r>
+      <w:r>
+        <w:t xml:space="preserve">W I есть, слабо:</w:t>
       </w:r>
     </w:p>
     <w:p>
@@ -10683,13 +10677,19 @@
         </w:numPr>
       </w:pPr>
       <w:r>
-        <w:t xml:space="preserve">407.436: +2 пм, FWHM 29 пм, S/N 10; 429.461: +5 пм (после общего сдвига куска −17 пм),</w:t>
-      </w:r>
-      <w:r>
-        <w:t xml:space="preserve"> </w:t>
-      </w:r>
-      <w:r>
-        <w:t xml:space="preserve">S/N 9; в data1/data2 того же файла обеих нет (S/N &lt; 3);</w:t>
+        <w:t xml:space="preserve">407.436 (S/N 10) и 429.461 (S/N 9) на своих местах: после калибровки шкалы по соседним</w:t>
+      </w:r>
+      <w:r>
+        <w:t xml:space="preserve"> </w:t>
+      </w:r>
+      <w:r>
+        <w:t xml:space="preserve">линиям того же куска (Xe, Mn, Sr, Ca, Cr; разброс 4–6 пм) остатки +6.7 и +5.0 пм;</w:t>
+      </w:r>
+      <w:r>
+        <w:t xml:space="preserve"> </w:t>
+      </w:r>
+      <w:r>
+        <w:t xml:space="preserve">ширина нормальная; в data1/data2 того же файла их нет;</w:t>
       </w:r>
     </w:p>
     <w:p>
@@ -10701,13 +10701,25 @@
         </w:numPr>
       </w:pPr>
       <w:r>
-        <w:t xml:space="preserve">отношение 429.461/407.436 = 0.70, по g·A из NIST 0.8–1.2 (в зависимости от T);</w:t>
-      </w:r>
-      <w:r>
-        <w:t xml:space="preserve"> </w:t>
-      </w:r>
-      <w:r>
-        <w:t xml:space="preserve">430.211: S/N 4 — как и ожидается (≈0.4 от 407.436);</w:t>
+        <w:t xml:space="preserve">разность «hot − data2» (линии разряда вычитаются) по всем 185 изолированным линиям W I с A:</w:t>
+      </w:r>
+      <w:r>
+        <w:t xml:space="preserve"> </w:t>
+      </w:r>
+      <w:r>
+        <w:t xml:space="preserve">при T ≈ 0.4–0.7 эВ модель g·A·exp(−E_k/T) описывает видимые линии — 429.461: 195 / 161</w:t>
+      </w:r>
+      <w:r>
+        <w:t xml:space="preserve"> </w:t>
+      </w:r>
+      <w:r>
+        <w:t xml:space="preserve">(модель / измерено, отсчёты), 407.436: 175–194 / 221, 430.211: 80 / 59, 406.995: 25–36 / 42,</w:t>
+      </w:r>
+      <w:r>
+        <w:t xml:space="preserve"> </w:t>
+      </w:r>
+      <w:r>
+        <w:t xml:space="preserve">505.328: 23–46 / 26; линии с верхних уровней 4.8–5.7 эВ при такой T ниже шума — как и есть;</w:t>
       </w:r>
     </w:p>
     <w:p>
@@ -10719,37 +10731,180 @@
         </w:numPr>
       </w:pPr>
       <w:r>
-        <w:t xml:space="preserve">400.875 (самая сильная по NIST) тоже растёт при нагреве, но слита с Xe II 400.846;</w:t>
+        <w:t xml:space="preserve">все найденные линии — переходы с нижнего уровня 5d⁵6s ⁷S₃ (0.37 эВ) на 5d⁵6p ⁷P°/⁷D°.</w:t>
       </w:r>
     </w:p>
     <w:p>
       <w:pPr>
         <w:pStyle w:val="Compact"/>
         <w:numPr>
-          <w:ilvl w:val="1"/>
-          <w:numId w:val="1033"/>
+          <w:ilvl w:val="0"/>
+          <w:numId w:val="1032"/>
         </w:numPr>
       </w:pPr>
       <w:r>
-        <w:t xml:space="preserve">ни одна из 23 контрольных позиций не ведёт себя так («есть в hot, нет в data2»);</w:t>
+        <w:rPr>
+          <w:b/>
+          <w:bCs/>
+        </w:rPr>
+        <w:t xml:space="preserve">Сумма 9 листов A3</w:t>
+      </w:r>
+      <w:r>
+        <w:t xml:space="preserve"> </w:t>
+      </w:r>
+      <w:r>
+        <w:t xml:space="preserve">(шум в ~3 раза меньше): 407.436 и 429.461 видны — ~4σ и ~3.6σ с</w:t>
+      </w:r>
+      <w:r>
+        <w:t xml:space="preserve"> </w:t>
+      </w:r>
+      <w:r>
+        <w:t xml:space="preserve">поправкой на разброс контрольных позиций (в сумме много слабых неопознанных линий),</w:t>
+      </w:r>
+      <w:r>
+        <w:t xml:space="preserve"> </w:t>
+      </w:r>
+      <w:r>
+        <w:t xml:space="preserve">остатки положения +6.8 и +7.0 пм —</w:t>
+      </w:r>
+      <w:r>
+        <w:t xml:space="preserve"> </w:t>
+      </w:r>
+      <w:r>
+        <w:rPr>
+          <w:b/>
+          <w:bCs/>
+        </w:rPr>
+        <w:t xml:space="preserve">те же, что в</w:t>
+      </w:r>
+      <w:r>
+        <w:rPr>
+          <w:b/>
+          <w:bCs/>
+        </w:rPr>
+        <w:t xml:space="preserve"> </w:t>
+      </w:r>
+      <w:r>
+        <w:rPr>
+          <w:rStyle w:val="VerbatimChar"/>
+          <w:b/>
+          <w:bCs/>
+        </w:rPr>
+        <w:t xml:space="preserve">data3_hot</w:t>
+      </w:r>
+      <w:r>
+        <w:t xml:space="preserve">; отношение</w:t>
+      </w:r>
+      <w:r>
+        <w:t xml:space="preserve"> </w:t>
+      </w:r>
+      <w:r>
+        <w:t xml:space="preserve">407.436 : 429.461 : 430.211 = 1 : 0.80 : 0.32 (в</w:t>
+      </w:r>
+      <w:r>
+        <w:t xml:space="preserve"> </w:t>
+      </w:r>
+      <w:r>
+        <w:rPr>
+          <w:rStyle w:val="VerbatimChar"/>
+        </w:rPr>
+        <w:t xml:space="preserve">data3_hot</w:t>
+      </w:r>
+      <w:r>
+        <w:t xml:space="preserve"> </w:t>
+      </w:r>
+      <w:r>
+        <w:t xml:space="preserve">1 : 0.73 : 0.27).</w:t>
       </w:r>
     </w:p>
     <w:p>
       <w:pPr>
         <w:pStyle w:val="Compact"/>
         <w:numPr>
-          <w:ilvl w:val="1"/>
-          <w:numId w:val="1033"/>
+          <w:ilvl w:val="0"/>
+          <w:numId w:val="1032"/>
         </w:numPr>
       </w:pPr>
       <w:r>
-        <w:t xml:space="preserve">соседи: Hf I 429.478, Zr I 429.479, Ti I 400.893 — этих элементов нет (их сильнейшие</w:t>
-      </w:r>
-      <w:r>
-        <w:t xml:space="preserve"> </w:t>
-      </w:r>
-      <w:r>
-        <w:t xml:space="preserve">линии не видны); Fe I 429.412 и 407.479, Os I 407.468 — слишком слабы или далеко.</w:t>
+        <w:t xml:space="preserve">Вольфрам идёт вместе с продуктами эмиттера: W I 407.436 / Ba I 553.548 = 0.012 (</w:t>
+      </w:r>
+      <w:r>
+        <w:rPr>
+          <w:rStyle w:val="VerbatimChar"/>
+        </w:rPr>
+        <w:t xml:space="preserve">data3_hot</w:t>
+      </w:r>
+      <w:r>
+        <w:t xml:space="preserve">)</w:t>
+      </w:r>
+      <w:r>
+        <w:t xml:space="preserve"> </w:t>
+      </w:r>
+      <w:r>
+        <w:t xml:space="preserve">и 0.028 (сумма A3); W / Sr II 407.771 = 0.11 и 0.25. В data2 (A25) при таком отношении W был</w:t>
+      </w:r>
+      <w:r>
+        <w:t xml:space="preserve"> </w:t>
+      </w:r>
+      <w:r>
+        <w:t xml:space="preserve">бы ~3 отсчёта — ниже шума, что согласуется.</w:t>
+      </w:r>
+    </w:p>
+    <w:p>
+      <w:pPr>
+        <w:pStyle w:val="Compact"/>
+        <w:numPr>
+          <w:ilvl w:val="0"/>
+          <w:numId w:val="1032"/>
+        </w:numPr>
+      </w:pPr>
+      <w:r>
+        <w:t xml:space="preserve">Проверить по спектрам</w:t>
+      </w:r>
+      <w:r>
+        <w:t xml:space="preserve"> </w:t>
+      </w:r>
+      <w:r>
+        <w:rPr>
+          <w:rStyle w:val="VerbatimChar"/>
+        </w:rPr>
+        <w:t xml:space="preserve">nakal</w:t>
+      </w:r>
+      <w:r>
+        <w:t xml:space="preserve"> </w:t>
+      </w:r>
+      <w:r>
+        <w:t xml:space="preserve">(окно 541.6–564.1 нм) нельзя: лучшая линия W I в окне</w:t>
+      </w:r>
+      <w:r>
+        <w:t xml:space="preserve"> </w:t>
+      </w:r>
+      <w:r>
+        <w:t xml:space="preserve">(551.468) должна быть ~20 отсчётов при шуме ~50.</w:t>
+      </w:r>
+    </w:p>
+    <w:p>
+      <w:pPr>
+        <w:pStyle w:val="Compact"/>
+        <w:numPr>
+          <w:ilvl w:val="0"/>
+          <w:numId w:val="1032"/>
+        </w:numPr>
+      </w:pPr>
+      <w:r>
+        <w:t xml:space="preserve">Ограничения: значимость держится на двух линиях; в разности hot − data2 и в сумме A3 есть</w:t>
+      </w:r>
+      <w:r>
+        <w:t xml:space="preserve"> </w:t>
+      </w:r>
+      <w:r>
+        <w:t xml:space="preserve">линии других элементов (404.56, 406.48 — избыток не от W). Соседи W 407.436 / 429.461</w:t>
+      </w:r>
+      <w:r>
+        <w:t xml:space="preserve"> </w:t>
+      </w:r>
+      <w:r>
+        <w:t xml:space="preserve">(Hf I 429.478, Zr I 429.479, Ti I 400.893) исключены: сильнейших линий Hf, Zr, Ti нет.</w:t>
       </w:r>
       <w:r>
         <w:t xml:space="preserve"> </w:t>

</xml_diff>

<commit_message>
New spectra (1-3 A): tungsten follows barium, not the discharge current; branching ratios from 14 sheets
branching_from_spectrum.py: find the segment joins from the local step (the wide
300-1003 nm format has a step changing from 13 to 5 pm); XE2_BR_MEASURED updated.

Co-Authored-By: Claude Opus 5.5 <noreply@anthropic.com>
Claude-Session: https://claude.ai/code/session_018nKkrJu4ehWWcEHTugH1GR
</commit_message>
<xml_diff>
--- a/docs/crm/lines_final.docx
+++ b/docs/crm/lines_final.docx
@@ -3443,13 +3443,13 @@
         <w:t xml:space="preserve">docs/crm/branching_measured.csv</w:t>
       </w:r>
       <w:r>
-        <w:t xml:space="preserve">. Спектры: A3 (5 листов),</w:t>
-      </w:r>
-      <w:r>
-        <w:t xml:space="preserve"> </w:t>
-      </w:r>
-      <w:r>
-        <w:t xml:space="preserve">A1 (2), A15, A25 (два файла) — 4 режима разряда, листы с насыщенной ветвью пропущены.</w:t>
+        <w:t xml:space="preserve">; листы с насыщенной ветвью</w:t>
+      </w:r>
+      <w:r>
+        <w:t xml:space="preserve"> </w:t>
+      </w:r>
+      <w:r>
+        <w:t xml:space="preserve">пропущены.</w:t>
       </w:r>
     </w:p>
     <w:tbl>
@@ -3631,21 +3631,21 @@
               <w:rPr>
                 <w:sz w:val="18"/>
               </w:rPr>
-              <w:t xml:space="preserve">(0.051–0.069), 10 листов</w:t>
-            </w:r>
-          </w:p>
-        </w:tc>
-        <w:tc>
-          <w:tcPr/>
-          <w:p>
-            <w:pPr>
-              <w:pStyle w:val="Compact"/>
-            </w:pPr>
-            <w:r>
-              <w:rPr>
-                <w:sz w:val="18"/>
-              </w:rPr>
-              <w:t xml:space="preserve">0.077</w:t>
+              <w:t xml:space="preserve">(0.051–0.069), 14 листов</w:t>
+            </w:r>
+          </w:p>
+        </w:tc>
+        <w:tc>
+          <w:tcPr/>
+          <w:p>
+            <w:pPr>
+              <w:pStyle w:val="Compact"/>
+            </w:pPr>
+            <w:r>
+              <w:rPr>
+                <w:sz w:val="18"/>
+              </w:rPr>
+              <w:t xml:space="preserve">0.078</w:t>
             </w:r>
           </w:p>
         </w:tc>
@@ -3745,35 +3745,35 @@
               <w:rPr>
                 <w:sz w:val="18"/>
               </w:rPr>
-              <w:t xml:space="preserve">(0.013–0.015), 10</w:t>
-            </w:r>
-          </w:p>
-        </w:tc>
-        <w:tc>
-          <w:tcPr/>
-          <w:p>
-            <w:pPr>
-              <w:pStyle w:val="Compact"/>
-            </w:pPr>
-            <w:r>
-              <w:rPr>
-                <w:sz w:val="18"/>
-              </w:rPr>
-              <w:t xml:space="preserve">0.021</w:t>
-            </w:r>
-          </w:p>
-        </w:tc>
-        <w:tc>
-          <w:tcPr/>
-          <w:p>
-            <w:pPr>
-              <w:pStyle w:val="Compact"/>
-            </w:pPr>
-            <w:r>
-              <w:rPr>
-                <w:sz w:val="18"/>
-              </w:rPr>
-              <w:t xml:space="preserve">0.40</w:t>
+              <w:t xml:space="preserve">(0.013–0.015), 14</w:t>
+            </w:r>
+          </w:p>
+        </w:tc>
+        <w:tc>
+          <w:tcPr/>
+          <w:p>
+            <w:pPr>
+              <w:pStyle w:val="Compact"/>
+            </w:pPr>
+            <w:r>
+              <w:rPr>
+                <w:sz w:val="18"/>
+              </w:rPr>
+              <w:t xml:space="preserve">0.022</w:t>
+            </w:r>
+          </w:p>
+        </w:tc>
+        <w:tc>
+          <w:tcPr/>
+          <w:p>
+            <w:pPr>
+              <w:pStyle w:val="Compact"/>
+            </w:pPr>
+            <w:r>
+              <w:rPr>
+                <w:sz w:val="18"/>
+              </w:rPr>
+              <w:t xml:space="preserve">0.35–0.40</w:t>
             </w:r>
           </w:p>
         </w:tc>
@@ -3973,21 +3973,21 @@
               <w:rPr>
                 <w:sz w:val="18"/>
               </w:rPr>
-              <w:t xml:space="preserve">(0.019–0.028), 9</w:t>
-            </w:r>
-          </w:p>
-        </w:tc>
-        <w:tc>
-          <w:tcPr/>
-          <w:p>
-            <w:pPr>
-              <w:pStyle w:val="Compact"/>
-            </w:pPr>
-            <w:r>
-              <w:rPr>
-                <w:sz w:val="18"/>
-              </w:rPr>
-              <w:t xml:space="preserve">0.028</w:t>
+              <w:t xml:space="preserve">(0.019–0.028), 12</w:t>
+            </w:r>
+          </w:p>
+        </w:tc>
+        <w:tc>
+          <w:tcPr/>
+          <w:p>
+            <w:pPr>
+              <w:pStyle w:val="Compact"/>
+            </w:pPr>
+            <w:r>
+              <w:rPr>
+                <w:sz w:val="18"/>
+              </w:rPr>
+              <w:t xml:space="preserve">0.029</w:t>
             </w:r>
           </w:p>
         </w:tc>
@@ -4075,7 +4075,7 @@
                 <w:bCs/>
                 <w:sz w:val="18"/>
               </w:rPr>
-              <w:t xml:space="preserve">0.049</w:t>
+              <w:t xml:space="preserve">0.048</w:t>
             </w:r>
             <w:r>
               <w:rPr>
@@ -4087,7 +4087,7 @@
               <w:rPr>
                 <w:sz w:val="18"/>
               </w:rPr>
-              <w:t xml:space="preserve">(0.047–0.054), 7</w:t>
+              <w:t xml:space="preserve">(0.046–0.054), 10</w:t>
             </w:r>
           </w:p>
         </w:tc>
@@ -4189,7 +4189,7 @@
                 <w:bCs/>
                 <w:sz w:val="18"/>
               </w:rPr>
-              <w:t xml:space="preserve">0.64</w:t>
+              <w:t xml:space="preserve">0.63</w:t>
             </w:r>
             <w:r>
               <w:rPr>
@@ -4201,7 +4201,7 @@
               <w:rPr>
                 <w:sz w:val="18"/>
               </w:rPr>
-              <w:t xml:space="preserve">(0.52–0.65), 10</w:t>
+              <w:t xml:space="preserve">(0.55–0.65), 14</w:t>
             </w:r>
           </w:p>
         </w:tc>
@@ -4229,7 +4229,7 @@
               <w:rPr>
                 <w:sz w:val="18"/>
               </w:rPr>
-              <w:t xml:space="preserve">0.11</w:t>
+              <w:t xml:space="preserve">0.04–0.11</w:t>
             </w:r>
           </w:p>
         </w:tc>
@@ -4263,6 +4263,20 @@
         </w:tc>
       </w:tr>
     </w:tbl>
+    <w:p>
+      <w:pPr>
+        <w:pStyle w:val="BodyText"/>
+      </w:pPr>
+      <w:r>
+        <w:t xml:space="preserve">Листы: A3 (5), A1 (2), A15, A25 (два файла), A1_new, A2_new, A25_new, A3_new — ток разряда</w:t>
+      </w:r>
+      <w:r>
+        <w:t xml:space="preserve"> </w:t>
+      </w:r>
+      <w:r>
+        <w:t xml:space="preserve">1–3 А, выдержки разные (на отношения не влияет).</w:t>
+      </w:r>
+    </w:p>
     <w:p>
       <w:pPr>
         <w:pStyle w:val="BodyText"/>
@@ -10826,119 +10840,29 @@
         </w:numPr>
       </w:pPr>
       <w:r>
-        <w:t xml:space="preserve">Вольфрам идёт вместе с продуктами эмиттера: W I 407.436 / Ba I 553.548 = 0.012 (</w:t>
-      </w:r>
-      <w:r>
-        <w:rPr>
-          <w:rStyle w:val="VerbatimChar"/>
-        </w:rPr>
-        <w:t xml:space="preserve">data3_hot</w:t>
-      </w:r>
-      <w:r>
-        <w:t xml:space="preserve">)</w:t>
-      </w:r>
-      <w:r>
-        <w:t xml:space="preserve"> </w:t>
-      </w:r>
-      <w:r>
-        <w:t xml:space="preserve">и 0.028 (сумма A3); W / Sr II 407.771 = 0.11 и 0.25. В data2 (A25) при таком отношении W был</w:t>
-      </w:r>
-      <w:r>
-        <w:t xml:space="preserve"> </w:t>
-      </w:r>
-      <w:r>
-        <w:t xml:space="preserve">бы ~3 отсчёта — ниже шума, что согласуется.</w:t>
-      </w:r>
-    </w:p>
-    <w:p>
-      <w:pPr>
-        <w:pStyle w:val="Compact"/>
-        <w:numPr>
-          <w:ilvl w:val="0"/>
-          <w:numId w:val="1032"/>
-        </w:numPr>
-      </w:pPr>
-      <w:r>
-        <w:t xml:space="preserve">Проверить по спектрам</w:t>
-      </w:r>
-      <w:r>
-        <w:t xml:space="preserve"> </w:t>
-      </w:r>
-      <w:r>
-        <w:rPr>
-          <w:rStyle w:val="VerbatimChar"/>
-        </w:rPr>
-        <w:t xml:space="preserve">nakal</w:t>
-      </w:r>
-      <w:r>
-        <w:t xml:space="preserve"> </w:t>
-      </w:r>
-      <w:r>
-        <w:t xml:space="preserve">(окно 541.6–564.1 нм) нельзя: лучшая линия W I в окне</w:t>
-      </w:r>
-      <w:r>
-        <w:t xml:space="preserve"> </w:t>
-      </w:r>
-      <w:r>
-        <w:t xml:space="preserve">(551.468) должна быть ~20 отсчётов при шуме ~50.</w:t>
-      </w:r>
-    </w:p>
-    <w:p>
-      <w:pPr>
-        <w:pStyle w:val="Compact"/>
-        <w:numPr>
-          <w:ilvl w:val="0"/>
-          <w:numId w:val="1032"/>
-        </w:numPr>
-      </w:pPr>
-      <w:r>
-        <w:t xml:space="preserve">Ограничения: значимость держится на двух линиях; в разности hot − data2 и в сумме A3 есть</w:t>
-      </w:r>
-      <w:r>
-        <w:t xml:space="preserve"> </w:t>
-      </w:r>
-      <w:r>
-        <w:t xml:space="preserve">линии других элементов (404.56, 406.48 — избыток не от W). Соседи W 407.436 / 429.461</w:t>
-      </w:r>
-      <w:r>
-        <w:t xml:space="preserve"> </w:t>
-      </w:r>
-      <w:r>
-        <w:t xml:space="preserve">(Hf I 429.478, Zr I 429.479, Ti I 400.893) исключены: сильнейших линий Hf, Zr, Ti нет.</w:t>
-      </w:r>
-      <w:r>
-        <w:t xml:space="preserve"> </w:t>
-      </w:r>
-      <w:r>
-        <w:t xml:space="preserve">Для диагностики W не годится: две слабые линии, видны только у горячего катода и в сумме листов A3.</w:t>
-      </w:r>
-    </w:p>
-    <w:p>
-      <w:pPr>
-        <w:pStyle w:val="Compact"/>
-        <w:numPr>
-          <w:ilvl w:val="0"/>
-          <w:numId w:val="1032"/>
-        </w:numPr>
-      </w:pPr>
-      <w:r>
         <w:rPr>
           <w:b/>
           <w:bCs/>
         </w:rPr>
-        <w:t xml:space="preserve">Попутно — что ещё появляется у горячего катода</w:t>
-      </w:r>
-      <w:r>
-        <w:t xml:space="preserve"> </w:t>
-      </w:r>
-      <w:r>
-        <w:t xml:space="preserve">(A25 data3_hot; положение ±10 пм,</w:t>
-      </w:r>
-      <w:r>
-        <w:t xml:space="preserve"> </w:t>
-      </w:r>
-      <w:r>
-        <w:t xml:space="preserve">нормальная ширина, в data1/data2 нет или в разы слабее):</w:t>
+        <w:t xml:space="preserve">От чего зависит количество вольфрама</w:t>
+      </w:r>
+      <w:r>
+        <w:t xml:space="preserve"> </w:t>
+      </w:r>
+      <w:r>
+        <w:t xml:space="preserve">(все широкие спектры, ток разряда 1–3 А; W/Xe —</w:t>
+      </w:r>
+      <w:r>
+        <w:t xml:space="preserve"> </w:t>
+      </w:r>
+      <w:r>
+        <w:t xml:space="preserve">амплитуда W I 407.436 и 429.461 к медиане линий Xe II 401–450 нм того же кадра, поэтому</w:t>
+      </w:r>
+      <w:r>
+        <w:t xml:space="preserve"> </w:t>
+      </w:r>
+      <w:r>
+        <w:t xml:space="preserve">выдержка не влияет; ошибка — с учётом разброса контрольных позиций):</w:t>
       </w:r>
     </w:p>
     <w:tbl>
@@ -10975,49 +10899,49 @@
               <w:rPr>
                 <w:sz w:val="18"/>
               </w:rPr>
-              <w:t xml:space="preserve">элемент</w:t>
-            </w:r>
-          </w:p>
-        </w:tc>
-        <w:tc>
-          <w:tcPr/>
-          <w:p>
-            <w:pPr>
-              <w:pStyle w:val="Compact"/>
-            </w:pPr>
-            <w:r>
-              <w:rPr>
-                <w:sz w:val="18"/>
-              </w:rPr>
-              <w:t xml:space="preserve">линии</w:t>
-            </w:r>
-          </w:p>
-        </w:tc>
-        <w:tc>
-          <w:tcPr/>
-          <w:p>
-            <w:pPr>
-              <w:pStyle w:val="Compact"/>
-            </w:pPr>
-            <w:r>
-              <w:rPr>
-                <w:sz w:val="18"/>
-              </w:rPr>
-              <w:t xml:space="preserve">наблюдение</w:t>
-            </w:r>
-          </w:p>
-        </w:tc>
-        <w:tc>
-          <w:tcPr/>
-          <w:p>
-            <w:pPr>
-              <w:pStyle w:val="Compact"/>
-            </w:pPr>
-            <w:r>
-              <w:rPr>
-                <w:sz w:val="18"/>
-              </w:rPr>
-              <w:t xml:space="preserve">вероятный источник</w:t>
+              <w:t xml:space="preserve">спектр</w:t>
+            </w:r>
+          </w:p>
+        </w:tc>
+        <w:tc>
+          <w:tcPr/>
+          <w:p>
+            <w:pPr>
+              <w:pStyle w:val="Compact"/>
+            </w:pPr>
+            <w:r>
+              <w:rPr>
+                <w:sz w:val="18"/>
+              </w:rPr>
+              <w:t xml:space="preserve">ток, А</w:t>
+            </w:r>
+          </w:p>
+        </w:tc>
+        <w:tc>
+          <w:tcPr/>
+          <w:p>
+            <w:pPr>
+              <w:pStyle w:val="Compact"/>
+            </w:pPr>
+            <w:r>
+              <w:rPr>
+                <w:sz w:val="18"/>
+              </w:rPr>
+              <w:t xml:space="preserve">Ba I 553.5 / Xe</w:t>
+            </w:r>
+          </w:p>
+        </w:tc>
+        <w:tc>
+          <w:tcPr/>
+          <w:p>
+            <w:pPr>
+              <w:pStyle w:val="Compact"/>
+            </w:pPr>
+            <w:r>
+              <w:rPr>
+                <w:sz w:val="18"/>
+              </w:rPr>
+              <w:t xml:space="preserve">W / Xe, 10⁻³</w:t>
             </w:r>
           </w:p>
         </w:tc>
@@ -11033,49 +10957,49 @@
               <w:rPr>
                 <w:sz w:val="18"/>
               </w:rPr>
-              <w:t xml:space="preserve">Mn I</w:t>
-            </w:r>
-          </w:p>
-        </w:tc>
-        <w:tc>
-          <w:tcPr/>
-          <w:p>
-            <w:pPr>
-              <w:pStyle w:val="Compact"/>
-            </w:pPr>
-            <w:r>
-              <w:rPr>
-                <w:sz w:val="18"/>
-              </w:rPr>
-              <w:t xml:space="preserve">403.076 / 403.307 / 403.449 (резонансный триплет)</w:t>
-            </w:r>
-          </w:p>
-        </w:tc>
-        <w:tc>
-          <w:tcPr/>
-          <w:p>
-            <w:pPr>
-              <w:pStyle w:val="Compact"/>
-            </w:pPr>
-            <w:r>
-              <w:rPr>
-                <w:sz w:val="18"/>
-              </w:rPr>
-              <w:t xml:space="preserve">S/N 72 / 49 / 30; отношение 1 : 0.75 : 0.48, по NIST 1 : 0.75 : 0.50</w:t>
-            </w:r>
-          </w:p>
-        </w:tc>
-        <w:tc>
-          <w:tcPr/>
-          <w:p>
-            <w:pPr>
-              <w:pStyle w:val="Compact"/>
-            </w:pPr>
-            <w:r>
-              <w:rPr>
-                <w:sz w:val="18"/>
-              </w:rPr>
-              <w:t xml:space="preserve">нагретая сталь (держатель, нагреватель)?</w:t>
+              <w:t xml:space="preserve">A25 data3_hot (+ накал)</w:t>
+            </w:r>
+          </w:p>
+        </w:tc>
+        <w:tc>
+          <w:tcPr/>
+          <w:p>
+            <w:pPr>
+              <w:pStyle w:val="Compact"/>
+            </w:pPr>
+            <w:r>
+              <w:rPr>
+                <w:sz w:val="18"/>
+              </w:rPr>
+              <w:t xml:space="preserve">2.5</w:t>
+            </w:r>
+          </w:p>
+        </w:tc>
+        <w:tc>
+          <w:tcPr/>
+          <w:p>
+            <w:pPr>
+              <w:pStyle w:val="Compact"/>
+            </w:pPr>
+            <w:r>
+              <w:rPr>
+                <w:sz w:val="18"/>
+              </w:rPr>
+              <w:t xml:space="preserve">1.37</w:t>
+            </w:r>
+          </w:p>
+        </w:tc>
+        <w:tc>
+          <w:tcPr/>
+          <w:p>
+            <w:pPr>
+              <w:pStyle w:val="Compact"/>
+            </w:pPr>
+            <w:r>
+              <w:rPr>
+                <w:sz w:val="18"/>
+              </w:rPr>
+              <w:t xml:space="preserve">22 ± 4</w:t>
             </w:r>
           </w:p>
         </w:tc>
@@ -11091,49 +11015,49 @@
               <w:rPr>
                 <w:sz w:val="18"/>
               </w:rPr>
-              <w:t xml:space="preserve">Cr I</w:t>
-            </w:r>
-          </w:p>
-        </w:tc>
-        <w:tc>
-          <w:tcPr/>
-          <w:p>
-            <w:pPr>
-              <w:pStyle w:val="Compact"/>
-            </w:pPr>
-            <w:r>
-              <w:rPr>
-                <w:sz w:val="18"/>
-              </w:rPr>
-              <w:t xml:space="preserve">425.435 / 427.480 / 428.972 (резонансный триплет)</w:t>
-            </w:r>
-          </w:p>
-        </w:tc>
-        <w:tc>
-          <w:tcPr/>
-          <w:p>
-            <w:pPr>
-              <w:pStyle w:val="Compact"/>
-            </w:pPr>
-            <w:r>
-              <w:rPr>
-                <w:sz w:val="18"/>
-              </w:rPr>
-              <w:t xml:space="preserve">1 : 0.61 : 0.44, по NIST 1 : 0.71 : 0.43</w:t>
-            </w:r>
-          </w:p>
-        </w:tc>
-        <w:tc>
-          <w:tcPr/>
-          <w:p>
-            <w:pPr>
-              <w:pStyle w:val="Compact"/>
-            </w:pPr>
-            <w:r>
-              <w:rPr>
-                <w:sz w:val="18"/>
-              </w:rPr>
-              <w:t xml:space="preserve">то же</w:t>
+              <w:t xml:space="preserve">A3 data3–11 (сумма)</w:t>
+            </w:r>
+          </w:p>
+        </w:tc>
+        <w:tc>
+          <w:tcPr/>
+          <w:p>
+            <w:pPr>
+              <w:pStyle w:val="Compact"/>
+            </w:pPr>
+            <w:r>
+              <w:rPr>
+                <w:sz w:val="18"/>
+              </w:rPr>
+              <w:t xml:space="preserve">3</w:t>
+            </w:r>
+          </w:p>
+        </w:tc>
+        <w:tc>
+          <w:tcPr/>
+          <w:p>
+            <w:pPr>
+              <w:pStyle w:val="Compact"/>
+            </w:pPr>
+            <w:r>
+              <w:rPr>
+                <w:sz w:val="18"/>
+              </w:rPr>
+              <w:t xml:space="preserve">0.85</w:t>
+            </w:r>
+          </w:p>
+        </w:tc>
+        <w:tc>
+          <w:tcPr/>
+          <w:p>
+            <w:pPr>
+              <w:pStyle w:val="Compact"/>
+            </w:pPr>
+            <w:r>
+              <w:rPr>
+                <w:sz w:val="18"/>
+              </w:rPr>
+              <w:t xml:space="preserve">23 ± 4</w:t>
             </w:r>
           </w:p>
         </w:tc>
@@ -11149,49 +11073,49 @@
               <w:rPr>
                 <w:sz w:val="18"/>
               </w:rPr>
-              <w:t xml:space="preserve">Fe I</w:t>
-            </w:r>
-          </w:p>
-        </w:tc>
-        <w:tc>
-          <w:tcPr/>
-          <w:p>
-            <w:pPr>
-              <w:pStyle w:val="Compact"/>
-            </w:pPr>
-            <w:r>
-              <w:rPr>
-                <w:sz w:val="18"/>
-              </w:rPr>
-              <w:t xml:space="preserve">404.581, 406.359, 427.176</w:t>
-            </w:r>
-          </w:p>
-        </w:tc>
-        <w:tc>
-          <w:tcPr/>
-          <w:p>
-            <w:pPr>
-              <w:pStyle w:val="Compact"/>
-            </w:pPr>
-            <w:r>
-              <w:rPr>
-                <w:sz w:val="18"/>
-              </w:rPr>
-              <w:t xml:space="preserve">S/N 12–28, широкие (возможны бленды)</w:t>
-            </w:r>
-          </w:p>
-        </w:tc>
-        <w:tc>
-          <w:tcPr/>
-          <w:p>
-            <w:pPr>
-              <w:pStyle w:val="Compact"/>
-            </w:pPr>
-            <w:r>
-              <w:rPr>
-                <w:sz w:val="18"/>
-              </w:rPr>
-              <w:t xml:space="preserve">то же</w:t>
+              <w:t xml:space="preserve">A3 data1</w:t>
+            </w:r>
+          </w:p>
+        </w:tc>
+        <w:tc>
+          <w:tcPr/>
+          <w:p>
+            <w:pPr>
+              <w:pStyle w:val="Compact"/>
+            </w:pPr>
+            <w:r>
+              <w:rPr>
+                <w:sz w:val="18"/>
+              </w:rPr>
+              <w:t xml:space="preserve">3</w:t>
+            </w:r>
+          </w:p>
+        </w:tc>
+        <w:tc>
+          <w:tcPr/>
+          <w:p>
+            <w:pPr>
+              <w:pStyle w:val="Compact"/>
+            </w:pPr>
+            <w:r>
+              <w:rPr>
+                <w:sz w:val="18"/>
+              </w:rPr>
+              <w:t xml:space="preserve">0.47</w:t>
+            </w:r>
+          </w:p>
+        </w:tc>
+        <w:tc>
+          <w:tcPr/>
+          <w:p>
+            <w:pPr>
+              <w:pStyle w:val="Compact"/>
+            </w:pPr>
+            <w:r>
+              <w:rPr>
+                <w:sz w:val="18"/>
+              </w:rPr>
+              <w:t xml:space="preserve">19 ± 3</w:t>
             </w:r>
           </w:p>
         </w:tc>
@@ -11207,49 +11131,49 @@
               <w:rPr>
                 <w:sz w:val="18"/>
               </w:rPr>
-              <w:t xml:space="preserve">Sr II</w:t>
-            </w:r>
-          </w:p>
-        </w:tc>
-        <w:tc>
-          <w:tcPr/>
-          <w:p>
-            <w:pPr>
-              <w:pStyle w:val="Compact"/>
-            </w:pPr>
-            <w:r>
-              <w:rPr>
-                <w:sz w:val="18"/>
-              </w:rPr>
-              <w:t xml:space="preserve">407.771 (резонансная)</w:t>
-            </w:r>
-          </w:p>
-        </w:tc>
-        <w:tc>
-          <w:tcPr/>
-          <w:p>
-            <w:pPr>
-              <w:pStyle w:val="Compact"/>
-            </w:pPr>
-            <w:r>
-              <w:rPr>
-                <w:sz w:val="18"/>
-              </w:rPr>
-              <w:t xml:space="preserve">S/N 106</w:t>
-            </w:r>
-          </w:p>
-        </w:tc>
-        <w:tc>
-          <w:tcPr/>
-          <w:p>
-            <w:pPr>
-              <w:pStyle w:val="Compact"/>
-            </w:pPr>
-            <w:r>
-              <w:rPr>
-                <w:sz w:val="18"/>
-              </w:rPr>
-              <w:t xml:space="preserve">пропитка эмиттера</w:t>
+              <w:t xml:space="preserve">A25 (второй файл)</w:t>
+            </w:r>
+          </w:p>
+        </w:tc>
+        <w:tc>
+          <w:tcPr/>
+          <w:p>
+            <w:pPr>
+              <w:pStyle w:val="Compact"/>
+            </w:pPr>
+            <w:r>
+              <w:rPr>
+                <w:sz w:val="18"/>
+              </w:rPr>
+              <w:t xml:space="preserve">2.5</w:t>
+            </w:r>
+          </w:p>
+        </w:tc>
+        <w:tc>
+          <w:tcPr/>
+          <w:p>
+            <w:pPr>
+              <w:pStyle w:val="Compact"/>
+            </w:pPr>
+            <w:r>
+              <w:rPr>
+                <w:sz w:val="18"/>
+              </w:rPr>
+              <w:t xml:space="preserve">0.27</w:t>
+            </w:r>
+          </w:p>
+        </w:tc>
+        <w:tc>
+          <w:tcPr/>
+          <w:p>
+            <w:pPr>
+              <w:pStyle w:val="Compact"/>
+            </w:pPr>
+            <w:r>
+              <w:rPr>
+                <w:sz w:val="18"/>
+              </w:rPr>
+              <w:t xml:space="preserve">5.5 ± 2.2</w:t>
             </w:r>
           </w:p>
         </w:tc>
@@ -11265,49 +11189,49 @@
               <w:rPr>
                 <w:sz w:val="18"/>
               </w:rPr>
-              <w:t xml:space="preserve">Ca I, Ca II</w:t>
-            </w:r>
-          </w:p>
-        </w:tc>
-        <w:tc>
-          <w:tcPr/>
-          <w:p>
-            <w:pPr>
-              <w:pStyle w:val="Compact"/>
-            </w:pPr>
-            <w:r>
-              <w:rPr>
-                <w:sz w:val="18"/>
-              </w:rPr>
-              <w:t xml:space="preserve">422.673; 393.366, 396.847</w:t>
-            </w:r>
-          </w:p>
-        </w:tc>
-        <w:tc>
-          <w:tcPr/>
-          <w:p>
-            <w:pPr>
-              <w:pStyle w:val="Compact"/>
-            </w:pPr>
-            <w:r>
-              <w:rPr>
-                <w:sz w:val="18"/>
-              </w:rPr>
-              <w:t xml:space="preserve">S/N 65, 156, 65</w:t>
-            </w:r>
-          </w:p>
-        </w:tc>
-        <w:tc>
-          <w:tcPr/>
-          <w:p>
-            <w:pPr>
-              <w:pStyle w:val="Compact"/>
-            </w:pPr>
-            <w:r>
-              <w:rPr>
-                <w:sz w:val="18"/>
-              </w:rPr>
-              <w:t xml:space="preserve">пропитка (алюминат Ba–Ca)</w:t>
+              <w:t xml:space="preserve">A25_new</w:t>
+            </w:r>
+          </w:p>
+        </w:tc>
+        <w:tc>
+          <w:tcPr/>
+          <w:p>
+            <w:pPr>
+              <w:pStyle w:val="Compact"/>
+            </w:pPr>
+            <w:r>
+              <w:rPr>
+                <w:sz w:val="18"/>
+              </w:rPr>
+              <w:t xml:space="preserve">2.5</w:t>
+            </w:r>
+          </w:p>
+        </w:tc>
+        <w:tc>
+          <w:tcPr/>
+          <w:p>
+            <w:pPr>
+              <w:pStyle w:val="Compact"/>
+            </w:pPr>
+            <w:r>
+              <w:rPr>
+                <w:sz w:val="18"/>
+              </w:rPr>
+              <w:t xml:space="preserve">0.11</w:t>
+            </w:r>
+          </w:p>
+        </w:tc>
+        <w:tc>
+          <w:tcPr/>
+          <w:p>
+            <w:pPr>
+              <w:pStyle w:val="Compact"/>
+            </w:pPr>
+            <w:r>
+              <w:rPr>
+                <w:sz w:val="18"/>
+              </w:rPr>
+              <w:t xml:space="preserve">7.9 ± 3.3</w:t>
             </w:r>
           </w:p>
         </w:tc>
@@ -11323,49 +11247,281 @@
               <w:rPr>
                 <w:sz w:val="18"/>
               </w:rPr>
-              <w:t xml:space="preserve">Al I</w:t>
-            </w:r>
-          </w:p>
-        </w:tc>
-        <w:tc>
-          <w:tcPr/>
-          <w:p>
-            <w:pPr>
-              <w:pStyle w:val="Compact"/>
-            </w:pPr>
-            <w:r>
-              <w:rPr>
-                <w:sz w:val="18"/>
-              </w:rPr>
-              <w:t xml:space="preserve">396.152</w:t>
-            </w:r>
-          </w:p>
-        </w:tc>
-        <w:tc>
-          <w:tcPr/>
-          <w:p>
-            <w:pPr>
-              <w:pStyle w:val="Compact"/>
-            </w:pPr>
-            <w:r>
-              <w:rPr>
-                <w:sz w:val="18"/>
-              </w:rPr>
-              <w:t xml:space="preserve">S/N 7</w:t>
-            </w:r>
-          </w:p>
-        </w:tc>
-        <w:tc>
-          <w:tcPr/>
-          <w:p>
-            <w:pPr>
-              <w:pStyle w:val="Compact"/>
-            </w:pPr>
-            <w:r>
-              <w:rPr>
-                <w:sz w:val="18"/>
-              </w:rPr>
-              <w:t xml:space="preserve">пропитка</w:t>
+              <w:t xml:space="preserve">A3_new</w:t>
+            </w:r>
+          </w:p>
+        </w:tc>
+        <w:tc>
+          <w:tcPr/>
+          <w:p>
+            <w:pPr>
+              <w:pStyle w:val="Compact"/>
+            </w:pPr>
+            <w:r>
+              <w:rPr>
+                <w:sz w:val="18"/>
+              </w:rPr>
+              <w:t xml:space="preserve">3</w:t>
+            </w:r>
+          </w:p>
+        </w:tc>
+        <w:tc>
+          <w:tcPr/>
+          <w:p>
+            <w:pPr>
+              <w:pStyle w:val="Compact"/>
+            </w:pPr>
+            <w:r>
+              <w:rPr>
+                <w:sz w:val="18"/>
+              </w:rPr>
+              <w:t xml:space="preserve">0.094</w:t>
+            </w:r>
+          </w:p>
+        </w:tc>
+        <w:tc>
+          <w:tcPr/>
+          <w:p>
+            <w:pPr>
+              <w:pStyle w:val="Compact"/>
+            </w:pPr>
+            <w:r>
+              <w:rPr>
+                <w:sz w:val="18"/>
+              </w:rPr>
+              <w:t xml:space="preserve">6.7 ± 3.1</w:t>
+            </w:r>
+          </w:p>
+        </w:tc>
+      </w:tr>
+      <w:tr>
+        <w:tc>
+          <w:tcPr/>
+          <w:p>
+            <w:pPr>
+              <w:pStyle w:val="Compact"/>
+            </w:pPr>
+            <w:r>
+              <w:rPr>
+                <w:sz w:val="18"/>
+              </w:rPr>
+              <w:t xml:space="preserve">A2_new</w:t>
+            </w:r>
+          </w:p>
+        </w:tc>
+        <w:tc>
+          <w:tcPr/>
+          <w:p>
+            <w:pPr>
+              <w:pStyle w:val="Compact"/>
+            </w:pPr>
+            <w:r>
+              <w:rPr>
+                <w:sz w:val="18"/>
+              </w:rPr>
+              <w:t xml:space="preserve">2</w:t>
+            </w:r>
+          </w:p>
+        </w:tc>
+        <w:tc>
+          <w:tcPr/>
+          <w:p>
+            <w:pPr>
+              <w:pStyle w:val="Compact"/>
+            </w:pPr>
+            <w:r>
+              <w:rPr>
+                <w:sz w:val="18"/>
+              </w:rPr>
+              <w:t xml:space="preserve">0.056</w:t>
+            </w:r>
+          </w:p>
+        </w:tc>
+        <w:tc>
+          <w:tcPr/>
+          <w:p>
+            <w:pPr>
+              <w:pStyle w:val="Compact"/>
+            </w:pPr>
+            <w:r>
+              <w:rPr>
+                <w:sz w:val="18"/>
+              </w:rPr>
+              <w:t xml:space="preserve">6.1 ± 4.2</w:t>
+            </w:r>
+          </w:p>
+        </w:tc>
+      </w:tr>
+      <w:tr>
+        <w:tc>
+          <w:tcPr/>
+          <w:p>
+            <w:pPr>
+              <w:pStyle w:val="Compact"/>
+            </w:pPr>
+            <w:r>
+              <w:rPr>
+                <w:sz w:val="18"/>
+              </w:rPr>
+              <w:t xml:space="preserve">A15</w:t>
+            </w:r>
+          </w:p>
+        </w:tc>
+        <w:tc>
+          <w:tcPr/>
+          <w:p>
+            <w:pPr>
+              <w:pStyle w:val="Compact"/>
+            </w:pPr>
+            <w:r>
+              <w:rPr>
+                <w:sz w:val="18"/>
+              </w:rPr>
+              <w:t xml:space="preserve">1.5</w:t>
+            </w:r>
+          </w:p>
+        </w:tc>
+        <w:tc>
+          <w:tcPr/>
+          <w:p>
+            <w:pPr>
+              <w:pStyle w:val="Compact"/>
+            </w:pPr>
+            <w:r>
+              <w:rPr>
+                <w:sz w:val="18"/>
+              </w:rPr>
+              <w:t xml:space="preserve">0.15</w:t>
+            </w:r>
+          </w:p>
+        </w:tc>
+        <w:tc>
+          <w:tcPr/>
+          <w:p>
+            <w:pPr>
+              <w:pStyle w:val="Compact"/>
+            </w:pPr>
+            <w:r>
+              <w:rPr>
+                <w:sz w:val="18"/>
+              </w:rPr>
+              <w:t xml:space="preserve">7.0 ± 5.6</w:t>
+            </w:r>
+          </w:p>
+        </w:tc>
+      </w:tr>
+      <w:tr>
+        <w:tc>
+          <w:tcPr/>
+          <w:p>
+            <w:pPr>
+              <w:pStyle w:val="Compact"/>
+            </w:pPr>
+            <w:r>
+              <w:rPr>
+                <w:sz w:val="18"/>
+              </w:rPr>
+              <w:t xml:space="preserve">A1, A1_new</w:t>
+            </w:r>
+          </w:p>
+        </w:tc>
+        <w:tc>
+          <w:tcPr/>
+          <w:p>
+            <w:pPr>
+              <w:pStyle w:val="Compact"/>
+            </w:pPr>
+            <w:r>
+              <w:rPr>
+                <w:sz w:val="18"/>
+              </w:rPr>
+              <w:t xml:space="preserve">1</w:t>
+            </w:r>
+          </w:p>
+        </w:tc>
+        <w:tc>
+          <w:tcPr/>
+          <w:p>
+            <w:pPr>
+              <w:pStyle w:val="Compact"/>
+            </w:pPr>
+            <w:r>
+              <w:rPr>
+                <w:sz w:val="18"/>
+              </w:rPr>
+              <w:t xml:space="preserve">0.04–0.15</w:t>
+            </w:r>
+          </w:p>
+        </w:tc>
+        <w:tc>
+          <w:tcPr/>
+          <w:p>
+            <w:pPr>
+              <w:pStyle w:val="Compact"/>
+            </w:pPr>
+            <w:r>
+              <w:rPr>
+                <w:sz w:val="18"/>
+              </w:rPr>
+              <w:t xml:space="preserve">−0.6…4.7, ± 3–8</w:t>
+            </w:r>
+          </w:p>
+        </w:tc>
+      </w:tr>
+      <w:tr>
+        <w:tc>
+          <w:tcPr/>
+          <w:p>
+            <w:pPr>
+              <w:pStyle w:val="Compact"/>
+            </w:pPr>
+            <w:r>
+              <w:rPr>
+                <w:sz w:val="18"/>
+              </w:rPr>
+              <w:t xml:space="preserve">A25 data1+data2</w:t>
+            </w:r>
+          </w:p>
+        </w:tc>
+        <w:tc>
+          <w:tcPr/>
+          <w:p>
+            <w:pPr>
+              <w:pStyle w:val="Compact"/>
+            </w:pPr>
+            <w:r>
+              <w:rPr>
+                <w:sz w:val="18"/>
+              </w:rPr>
+              <w:t xml:space="preserve">2.5</w:t>
+            </w:r>
+          </w:p>
+        </w:tc>
+        <w:tc>
+          <w:tcPr/>
+          <w:p>
+            <w:pPr>
+              <w:pStyle w:val="Compact"/>
+            </w:pPr>
+            <w:r>
+              <w:rPr>
+                <w:sz w:val="18"/>
+              </w:rPr>
+              <w:t xml:space="preserve">0.035</w:t>
+            </w:r>
+          </w:p>
+        </w:tc>
+        <w:tc>
+          <w:tcPr/>
+          <w:p>
+            <w:pPr>
+              <w:pStyle w:val="Compact"/>
+            </w:pPr>
+            <w:r>
+              <w:rPr>
+                <w:sz w:val="18"/>
+              </w:rPr>
+              <w:t xml:space="preserve">1.0 ± 4.0</w:t>
             </w:r>
           </w:p>
         </w:tc>
@@ -11376,31 +11532,46 @@
         <w:pStyle w:val="BodyText"/>
       </w:pPr>
       <w:r>
-        <w:t xml:space="preserve">В A3 (разряд) Ca II 393.366 (S/N 17), Ca I 422.673 (6.5), Sr II 407.771 (12) и триплет Mn</w:t>
-      </w:r>
-      <w:r>
-        <w:t xml:space="preserve"> </w:t>
-      </w:r>
-      <w:r>
-        <w:t xml:space="preserve">(S/N 5–8) тоже видны, но слабо. Поправка к прежнему выводу «W, Ca, Al в спектре нет»: в окне</w:t>
-      </w:r>
-      <w:r>
-        <w:t xml:space="preserve"> </w:t>
-      </w:r>
-      <w:r>
-        <w:t xml:space="preserve">541–565 нм их линий нет, а Ca, Al, Sr, Mn слабо видны в синей части. На выбранные линии</w:t>
-      </w:r>
-      <w:r>
-        <w:t xml:space="preserve"> </w:t>
-      </w:r>
-      <w:r>
-        <w:t xml:space="preserve">Xe II и Ba это почти не влияет. Соседи выбранных линий проверены по NIST для W, Ca, Al, Sr,</w:t>
-      </w:r>
-      <w:r>
-        <w:t xml:space="preserve"> </w:t>
-      </w:r>
-      <w:r>
-        <w:t xml:space="preserve">Mn, Cr, Fe (±1.5 FWHM):</w:t>
+        <w:t xml:space="preserve">Вывод:</w:t>
+      </w:r>
+      <w:r>
+        <w:t xml:space="preserve"> </w:t>
+      </w:r>
+      <w:r>
+        <w:rPr>
+          <w:b/>
+          <w:bCs/>
+        </w:rPr>
+        <w:t xml:space="preserve">вольфрам растёт вместе с барием и стронцием (состоянием эмиттера), а не с током</w:t>
+      </w:r>
+      <w:r>
+        <w:rPr>
+          <w:b/>
+          <w:bCs/>
+        </w:rPr>
+        <w:t xml:space="preserve"> </w:t>
+      </w:r>
+      <w:r>
+        <w:rPr>
+          <w:b/>
+          <w:bCs/>
+        </w:rPr>
+        <w:t xml:space="preserve">как таковым</w:t>
+      </w:r>
+      <w:r>
+        <w:t xml:space="preserve">: при 3 А в старом A3 W/Xe ≈ 0.02, в новом A3 — в 3 раза меньше, и бария там в</w:t>
+      </w:r>
+      <w:r>
+        <w:t xml:space="preserve"> </w:t>
+      </w:r>
+      <w:r>
+        <w:t xml:space="preserve">5–9 раз меньше. Во всех спектрах с малым барием W/Xe ≲ 0.008 (на пределе чувствительности;</w:t>
+      </w:r>
+      <w:r>
+        <w:t xml:space="preserve"> </w:t>
+      </w:r>
+      <w:r>
+        <w:t xml:space="preserve">среднее по ним ~0.005 — возможен слабый постоянный уровень, но не доказан).</w:t>
       </w:r>
     </w:p>
     <w:p>
@@ -11412,41 +11583,28 @@
         </w:numPr>
       </w:pPr>
       <w:r>
-        <w:rPr>
-          <w:b/>
-          <w:bCs/>
-        </w:rPr>
-        <w:t xml:space="preserve">545.090 ← Sr I 545.084</w:t>
-      </w:r>
-      <w:r>
-        <w:t xml:space="preserve"> </w:t>
-      </w:r>
-      <w:r>
-        <w:t xml:space="preserve">(6 пм, интенсивность 1000) — единственный реальный кандидат.</w:t>
-      </w:r>
-      <w:r>
-        <w:t xml:space="preserve"> </w:t>
-      </w:r>
-      <w:r>
-        <w:t xml:space="preserve">Сильнейшая линия Sr I (резонансная 460.733, интенсивность 29 000) в A3 — не больше 70</w:t>
-      </w:r>
-      <w:r>
-        <w:t xml:space="preserve"> </w:t>
-      </w:r>
-      <w:r>
-        <w:t xml:space="preserve">отсчётов (и то не чистый пик), значит Sr I 545.084 ≤ 1.3 отсчёта при 545.090 ≈ 170</w:t>
-      </w:r>
-      <w:r>
-        <w:t xml:space="preserve"> </w:t>
-      </w:r>
-      <w:r>
-        <w:t xml:space="preserve">(data10): &lt; 1 %, даже с запасом ×10 на неточность интенсивностей NIST — &lt; 10 %. В спектрах</w:t>
-      </w:r>
-      <w:r>
-        <w:t xml:space="preserve"> </w:t>
-      </w:r>
-      <w:r>
-        <w:t xml:space="preserve">с горячим катодом Sr сильнее — там проверяйте заново.</w:t>
+        <w:t xml:space="preserve">Проверить по спектрам</w:t>
+      </w:r>
+      <w:r>
+        <w:t xml:space="preserve"> </w:t>
+      </w:r>
+      <w:r>
+        <w:rPr>
+          <w:rStyle w:val="VerbatimChar"/>
+        </w:rPr>
+        <w:t xml:space="preserve">nakal</w:t>
+      </w:r>
+      <w:r>
+        <w:t xml:space="preserve"> </w:t>
+      </w:r>
+      <w:r>
+        <w:t xml:space="preserve">(окно 541.6–564.1 нм) нельзя: лучшая линия W I в окне</w:t>
+      </w:r>
+      <w:r>
+        <w:t xml:space="preserve"> </w:t>
+      </w:r>
+      <w:r>
+        <w:t xml:space="preserve">(551.468) должна быть ~20 отсчётов при шуме ~50.</w:t>
       </w:r>
     </w:p>
     <w:p>
@@ -11458,19 +11616,31 @@
         </w:numPr>
       </w:pPr>
       <w:r>
-        <w:t xml:space="preserve">493.408 ← Fe I 493.400 (1820), 553.548 ← Fe I 553.542 (1260), 455.403 ← Cr I 455.395 (18):</w:t>
-      </w:r>
-      <w:r>
-        <w:t xml:space="preserve"> </w:t>
-      </w:r>
-      <w:r>
-        <w:t xml:space="preserve">в сотни–тысячи раз слабее сильнейших линий Fe I и Cr I, которые в A3 едва видны (S/N 3–6) —</w:t>
-      </w:r>
-      <w:r>
-        <w:t xml:space="preserve"> </w:t>
-      </w:r>
-      <w:r>
-        <w:t xml:space="preserve">вклад пренебрежим.</w:t>
+        <w:t xml:space="preserve">Ограничения: значимость держится на двух линиях; в разности hot − data2 и в сумме A3 есть</w:t>
+      </w:r>
+      <w:r>
+        <w:t xml:space="preserve"> </w:t>
+      </w:r>
+      <w:r>
+        <w:t xml:space="preserve">линии других элементов (404.56, 406.48 — избыток не от W). Соседи W 407.436 / 429.461</w:t>
+      </w:r>
+      <w:r>
+        <w:t xml:space="preserve"> </w:t>
+      </w:r>
+      <w:r>
+        <w:t xml:space="preserve">(Hf I 429.478, Zr I 429.479, Ti I 400.893) исключены: сильнейших линий Hf, Zr, Ti нет.</w:t>
+      </w:r>
+      <w:r>
+        <w:t xml:space="preserve"> </w:t>
+      </w:r>
+      <w:r>
+        <w:t xml:space="preserve">Для диагностики W не годится: две слабые линии, заметны только при большом выносе бария</w:t>
+      </w:r>
+      <w:r>
+        <w:t xml:space="preserve"> </w:t>
+      </w:r>
+      <w:r>
+        <w:t xml:space="preserve">(горячий катод, старый A3).</w:t>
       </w:r>
     </w:p>
     <w:p>
@@ -11482,17 +11652,485 @@
         </w:numPr>
       </w:pPr>
       <w:r>
-        <w:t xml:space="preserve">543.896, 557.219, 561.667 — соседей нет; 545.045 — Fe II 545.009 (36 пм, Fe II не виден).</w:t>
-      </w:r>
-    </w:p>
-    <w:bookmarkEnd w:id="31"/>
-    <w:bookmarkStart w:id="32" w:name="X6d6f47a680e26386468108ba5d9a370d9572a0e"/>
-    <w:p>
-      <w:pPr>
-        <w:pStyle w:val="Heading2"/>
-      </w:pPr>
-      <w:r>
-        <w:t xml:space="preserve">3. Тестовый прогон (4 ядра)</w:t>
+        <w:rPr>
+          <w:b/>
+          <w:bCs/>
+        </w:rPr>
+        <w:t xml:space="preserve">Попутно — что ещё появляется у горячего катода</w:t>
+      </w:r>
+      <w:r>
+        <w:t xml:space="preserve"> </w:t>
+      </w:r>
+      <w:r>
+        <w:t xml:space="preserve">(A25 data3_hot; положение ±10 пм,</w:t>
+      </w:r>
+      <w:r>
+        <w:t xml:space="preserve"> </w:t>
+      </w:r>
+      <w:r>
+        <w:t xml:space="preserve">нормальная ширина, в data1/data2 нет или в разы слабее):</w:t>
+      </w:r>
+    </w:p>
+    <w:tbl>
+      <w:tblPr>
+        <w:tblStyle w:val="Table"/>
+        <w:tblW w:type="auto" w:w="0"/>
+        <w:tblLook w:firstRow="1" w:lastRow="0" w:firstColumn="0" w:lastColumn="0" w:noHBand="0" w:noVBand="0" w:val="0020"/>
+        <w:tblBorders>
+          <w:top w:val="single" w:sz="4" w:color="808080"/>
+          <w:left w:val="single" w:sz="4" w:color="808080"/>
+          <w:bottom w:val="single" w:sz="4" w:color="808080"/>
+          <w:right w:val="single" w:sz="4" w:color="808080"/>
+          <w:insideH w:val="single" w:sz="4" w:color="808080"/>
+          <w:insideV w:val="single" w:sz="4" w:color="808080"/>
+        </w:tblBorders>
+      </w:tblPr>
+      <w:tblGrid>
+        <w:gridCol w:w="1980"/>
+        <w:gridCol w:w="1980"/>
+        <w:gridCol w:w="1980"/>
+        <w:gridCol w:w="1980"/>
+      </w:tblGrid>
+      <w:tr>
+        <w:trPr>
+          <w:tblHeader w:val="on"/>
+        </w:trPr>
+        <w:tc>
+          <w:tcPr/>
+          <w:p>
+            <w:pPr>
+              <w:pStyle w:val="Compact"/>
+            </w:pPr>
+            <w:r>
+              <w:rPr>
+                <w:sz w:val="18"/>
+              </w:rPr>
+              <w:t xml:space="preserve">элемент</w:t>
+            </w:r>
+          </w:p>
+        </w:tc>
+        <w:tc>
+          <w:tcPr/>
+          <w:p>
+            <w:pPr>
+              <w:pStyle w:val="Compact"/>
+            </w:pPr>
+            <w:r>
+              <w:rPr>
+                <w:sz w:val="18"/>
+              </w:rPr>
+              <w:t xml:space="preserve">линии</w:t>
+            </w:r>
+          </w:p>
+        </w:tc>
+        <w:tc>
+          <w:tcPr/>
+          <w:p>
+            <w:pPr>
+              <w:pStyle w:val="Compact"/>
+            </w:pPr>
+            <w:r>
+              <w:rPr>
+                <w:sz w:val="18"/>
+              </w:rPr>
+              <w:t xml:space="preserve">наблюдение</w:t>
+            </w:r>
+          </w:p>
+        </w:tc>
+        <w:tc>
+          <w:tcPr/>
+          <w:p>
+            <w:pPr>
+              <w:pStyle w:val="Compact"/>
+            </w:pPr>
+            <w:r>
+              <w:rPr>
+                <w:sz w:val="18"/>
+              </w:rPr>
+              <w:t xml:space="preserve">вероятный источник</w:t>
+            </w:r>
+          </w:p>
+        </w:tc>
+      </w:tr>
+      <w:tr>
+        <w:tc>
+          <w:tcPr/>
+          <w:p>
+            <w:pPr>
+              <w:pStyle w:val="Compact"/>
+            </w:pPr>
+            <w:r>
+              <w:rPr>
+                <w:sz w:val="18"/>
+              </w:rPr>
+              <w:t xml:space="preserve">Mn I</w:t>
+            </w:r>
+          </w:p>
+        </w:tc>
+        <w:tc>
+          <w:tcPr/>
+          <w:p>
+            <w:pPr>
+              <w:pStyle w:val="Compact"/>
+            </w:pPr>
+            <w:r>
+              <w:rPr>
+                <w:sz w:val="18"/>
+              </w:rPr>
+              <w:t xml:space="preserve">403.076 / 403.307 / 403.449 (резонансный триплет)</w:t>
+            </w:r>
+          </w:p>
+        </w:tc>
+        <w:tc>
+          <w:tcPr/>
+          <w:p>
+            <w:pPr>
+              <w:pStyle w:val="Compact"/>
+            </w:pPr>
+            <w:r>
+              <w:rPr>
+                <w:sz w:val="18"/>
+              </w:rPr>
+              <w:t xml:space="preserve">S/N 72 / 49 / 30; отношение 1 : 0.75 : 0.48, по NIST 1 : 0.75 : 0.50</w:t>
+            </w:r>
+          </w:p>
+        </w:tc>
+        <w:tc>
+          <w:tcPr/>
+          <w:p>
+            <w:pPr>
+              <w:pStyle w:val="Compact"/>
+            </w:pPr>
+            <w:r>
+              <w:rPr>
+                <w:sz w:val="18"/>
+              </w:rPr>
+              <w:t xml:space="preserve">нагретая сталь (держатель, нагреватель)?</w:t>
+            </w:r>
+          </w:p>
+        </w:tc>
+      </w:tr>
+      <w:tr>
+        <w:tc>
+          <w:tcPr/>
+          <w:p>
+            <w:pPr>
+              <w:pStyle w:val="Compact"/>
+            </w:pPr>
+            <w:r>
+              <w:rPr>
+                <w:sz w:val="18"/>
+              </w:rPr>
+              <w:t xml:space="preserve">Cr I</w:t>
+            </w:r>
+          </w:p>
+        </w:tc>
+        <w:tc>
+          <w:tcPr/>
+          <w:p>
+            <w:pPr>
+              <w:pStyle w:val="Compact"/>
+            </w:pPr>
+            <w:r>
+              <w:rPr>
+                <w:sz w:val="18"/>
+              </w:rPr>
+              <w:t xml:space="preserve">425.435 / 427.480 / 428.972 (резонансный триплет)</w:t>
+            </w:r>
+          </w:p>
+        </w:tc>
+        <w:tc>
+          <w:tcPr/>
+          <w:p>
+            <w:pPr>
+              <w:pStyle w:val="Compact"/>
+            </w:pPr>
+            <w:r>
+              <w:rPr>
+                <w:sz w:val="18"/>
+              </w:rPr>
+              <w:t xml:space="preserve">1 : 0.61 : 0.44, по NIST 1 : 0.71 : 0.43</w:t>
+            </w:r>
+          </w:p>
+        </w:tc>
+        <w:tc>
+          <w:tcPr/>
+          <w:p>
+            <w:pPr>
+              <w:pStyle w:val="Compact"/>
+            </w:pPr>
+            <w:r>
+              <w:rPr>
+                <w:sz w:val="18"/>
+              </w:rPr>
+              <w:t xml:space="preserve">то же</w:t>
+            </w:r>
+          </w:p>
+        </w:tc>
+      </w:tr>
+      <w:tr>
+        <w:tc>
+          <w:tcPr/>
+          <w:p>
+            <w:pPr>
+              <w:pStyle w:val="Compact"/>
+            </w:pPr>
+            <w:r>
+              <w:rPr>
+                <w:sz w:val="18"/>
+              </w:rPr>
+              <w:t xml:space="preserve">Fe I</w:t>
+            </w:r>
+          </w:p>
+        </w:tc>
+        <w:tc>
+          <w:tcPr/>
+          <w:p>
+            <w:pPr>
+              <w:pStyle w:val="Compact"/>
+            </w:pPr>
+            <w:r>
+              <w:rPr>
+                <w:sz w:val="18"/>
+              </w:rPr>
+              <w:t xml:space="preserve">404.581, 406.359, 427.176</w:t>
+            </w:r>
+          </w:p>
+        </w:tc>
+        <w:tc>
+          <w:tcPr/>
+          <w:p>
+            <w:pPr>
+              <w:pStyle w:val="Compact"/>
+            </w:pPr>
+            <w:r>
+              <w:rPr>
+                <w:sz w:val="18"/>
+              </w:rPr>
+              <w:t xml:space="preserve">S/N 12–28, широкие (возможны бленды)</w:t>
+            </w:r>
+          </w:p>
+        </w:tc>
+        <w:tc>
+          <w:tcPr/>
+          <w:p>
+            <w:pPr>
+              <w:pStyle w:val="Compact"/>
+            </w:pPr>
+            <w:r>
+              <w:rPr>
+                <w:sz w:val="18"/>
+              </w:rPr>
+              <w:t xml:space="preserve">то же</w:t>
+            </w:r>
+          </w:p>
+        </w:tc>
+      </w:tr>
+      <w:tr>
+        <w:tc>
+          <w:tcPr/>
+          <w:p>
+            <w:pPr>
+              <w:pStyle w:val="Compact"/>
+            </w:pPr>
+            <w:r>
+              <w:rPr>
+                <w:sz w:val="18"/>
+              </w:rPr>
+              <w:t xml:space="preserve">Sr II</w:t>
+            </w:r>
+          </w:p>
+        </w:tc>
+        <w:tc>
+          <w:tcPr/>
+          <w:p>
+            <w:pPr>
+              <w:pStyle w:val="Compact"/>
+            </w:pPr>
+            <w:r>
+              <w:rPr>
+                <w:sz w:val="18"/>
+              </w:rPr>
+              <w:t xml:space="preserve">407.771 (резонансная)</w:t>
+            </w:r>
+          </w:p>
+        </w:tc>
+        <w:tc>
+          <w:tcPr/>
+          <w:p>
+            <w:pPr>
+              <w:pStyle w:val="Compact"/>
+            </w:pPr>
+            <w:r>
+              <w:rPr>
+                <w:sz w:val="18"/>
+              </w:rPr>
+              <w:t xml:space="preserve">S/N 106</w:t>
+            </w:r>
+          </w:p>
+        </w:tc>
+        <w:tc>
+          <w:tcPr/>
+          <w:p>
+            <w:pPr>
+              <w:pStyle w:val="Compact"/>
+            </w:pPr>
+            <w:r>
+              <w:rPr>
+                <w:sz w:val="18"/>
+              </w:rPr>
+              <w:t xml:space="preserve">пропитка эмиттера</w:t>
+            </w:r>
+          </w:p>
+        </w:tc>
+      </w:tr>
+      <w:tr>
+        <w:tc>
+          <w:tcPr/>
+          <w:p>
+            <w:pPr>
+              <w:pStyle w:val="Compact"/>
+            </w:pPr>
+            <w:r>
+              <w:rPr>
+                <w:sz w:val="18"/>
+              </w:rPr>
+              <w:t xml:space="preserve">Ca I, Ca II</w:t>
+            </w:r>
+          </w:p>
+        </w:tc>
+        <w:tc>
+          <w:tcPr/>
+          <w:p>
+            <w:pPr>
+              <w:pStyle w:val="Compact"/>
+            </w:pPr>
+            <w:r>
+              <w:rPr>
+                <w:sz w:val="18"/>
+              </w:rPr>
+              <w:t xml:space="preserve">422.673; 393.366, 396.847</w:t>
+            </w:r>
+          </w:p>
+        </w:tc>
+        <w:tc>
+          <w:tcPr/>
+          <w:p>
+            <w:pPr>
+              <w:pStyle w:val="Compact"/>
+            </w:pPr>
+            <w:r>
+              <w:rPr>
+                <w:sz w:val="18"/>
+              </w:rPr>
+              <w:t xml:space="preserve">S/N 65, 156, 65</w:t>
+            </w:r>
+          </w:p>
+        </w:tc>
+        <w:tc>
+          <w:tcPr/>
+          <w:p>
+            <w:pPr>
+              <w:pStyle w:val="Compact"/>
+            </w:pPr>
+            <w:r>
+              <w:rPr>
+                <w:sz w:val="18"/>
+              </w:rPr>
+              <w:t xml:space="preserve">пропитка (алюминат Ba–Ca)</w:t>
+            </w:r>
+          </w:p>
+        </w:tc>
+      </w:tr>
+      <w:tr>
+        <w:tc>
+          <w:tcPr/>
+          <w:p>
+            <w:pPr>
+              <w:pStyle w:val="Compact"/>
+            </w:pPr>
+            <w:r>
+              <w:rPr>
+                <w:sz w:val="18"/>
+              </w:rPr>
+              <w:t xml:space="preserve">Al I</w:t>
+            </w:r>
+          </w:p>
+        </w:tc>
+        <w:tc>
+          <w:tcPr/>
+          <w:p>
+            <w:pPr>
+              <w:pStyle w:val="Compact"/>
+            </w:pPr>
+            <w:r>
+              <w:rPr>
+                <w:sz w:val="18"/>
+              </w:rPr>
+              <w:t xml:space="preserve">396.152</w:t>
+            </w:r>
+          </w:p>
+        </w:tc>
+        <w:tc>
+          <w:tcPr/>
+          <w:p>
+            <w:pPr>
+              <w:pStyle w:val="Compact"/>
+            </w:pPr>
+            <w:r>
+              <w:rPr>
+                <w:sz w:val="18"/>
+              </w:rPr>
+              <w:t xml:space="preserve">S/N 7</w:t>
+            </w:r>
+          </w:p>
+        </w:tc>
+        <w:tc>
+          <w:tcPr/>
+          <w:p>
+            <w:pPr>
+              <w:pStyle w:val="Compact"/>
+            </w:pPr>
+            <w:r>
+              <w:rPr>
+                <w:sz w:val="18"/>
+              </w:rPr>
+              <w:t xml:space="preserve">пропитка</w:t>
+            </w:r>
+          </w:p>
+        </w:tc>
+      </w:tr>
+    </w:tbl>
+    <w:p>
+      <w:pPr>
+        <w:pStyle w:val="BodyText"/>
+      </w:pPr>
+      <w:r>
+        <w:t xml:space="preserve">В A3 (разряд) Ca II 393.366 (S/N 17), Ca I 422.673 (6.5), Sr II 407.771 (12) и триплет Mn</w:t>
+      </w:r>
+      <w:r>
+        <w:t xml:space="preserve"> </w:t>
+      </w:r>
+      <w:r>
+        <w:t xml:space="preserve">(S/N 5–8) тоже видны, но слабо. Поправка к прежнему выводу «W, Ca, Al в спектре нет»: в окне</w:t>
+      </w:r>
+      <w:r>
+        <w:t xml:space="preserve"> </w:t>
+      </w:r>
+      <w:r>
+        <w:t xml:space="preserve">541–565 нм их линий нет, а Ca, Al, Sr, Mn слабо видны в синей части. На выбранные линии</w:t>
+      </w:r>
+      <w:r>
+        <w:t xml:space="preserve"> </w:t>
+      </w:r>
+      <w:r>
+        <w:t xml:space="preserve">Xe II и Ba это почти не влияет. Соседи выбранных линий проверены по NIST для W, Ca, Al, Sr,</w:t>
+      </w:r>
+      <w:r>
+        <w:t xml:space="preserve"> </w:t>
+      </w:r>
+      <w:r>
+        <w:t xml:space="preserve">Mn, Cr, Fe (±1.5 FWHM):</w:t>
       </w:r>
     </w:p>
     <w:p>
@@ -11508,25 +12146,37 @@
           <w:b/>
           <w:bCs/>
         </w:rPr>
-        <w:t xml:space="preserve">Xe⁺, мишень и A.</w:t>
-      </w:r>
-      <w:r>
-        <w:t xml:space="preserve"> </w:t>
-      </w:r>
-      <w:r>
-        <w:t xml:space="preserve">Мишень — 4 мин 40 с; E1-ветви 19 уровней 6p — секунды. Против NIST:</w:t>
-      </w:r>
-      <w:r>
-        <w:t xml:space="preserve"> </w:t>
-      </w:r>
-      <w:r>
-        <w:t xml:space="preserve">21 линия, медиана DBSR/NIST = 1.03, 13 из 21 в пределах ×2. Проверка по спектру A3 — п. 6</w:t>
-      </w:r>
-      <w:r>
-        <w:t xml:space="preserve"> </w:t>
-      </w:r>
-      <w:r>
-        <w:t xml:space="preserve">Части 1.</w:t>
+        <w:t xml:space="preserve">545.090 ← Sr I 545.084</w:t>
+      </w:r>
+      <w:r>
+        <w:t xml:space="preserve"> </w:t>
+      </w:r>
+      <w:r>
+        <w:t xml:space="preserve">(6 пм, интенсивность 1000) — единственный реальный кандидат.</w:t>
+      </w:r>
+      <w:r>
+        <w:t xml:space="preserve"> </w:t>
+      </w:r>
+      <w:r>
+        <w:t xml:space="preserve">Сильнейшая линия Sr I (резонансная 460.733, интенсивность 29 000) в A3 — не больше 70</w:t>
+      </w:r>
+      <w:r>
+        <w:t xml:space="preserve"> </w:t>
+      </w:r>
+      <w:r>
+        <w:t xml:space="preserve">отсчётов (и то не чистый пик), значит Sr I 545.084 ≤ 1.3 отсчёта при 545.090 ≈ 170</w:t>
+      </w:r>
+      <w:r>
+        <w:t xml:space="preserve"> </w:t>
+      </w:r>
+      <w:r>
+        <w:t xml:space="preserve">(data10): &lt; 1 %, даже с запасом ×10 на неточность интенсивностей NIST — &lt; 10 %. В спектрах</w:t>
+      </w:r>
+      <w:r>
+        <w:t xml:space="preserve"> </w:t>
+      </w:r>
+      <w:r>
+        <w:t xml:space="preserve">с горячим катодом Sr сильнее — там проверяйте заново.</w:t>
       </w:r>
     </w:p>
     <w:p>
@@ -11538,44 +12188,19 @@
         </w:numPr>
       </w:pPr>
       <w:r>
-        <w:rPr>
-          <w:b/>
-          <w:bCs/>
-        </w:rPr>
-        <w:t xml:space="preserve">Ba II (</w:t>
-      </w:r>
-      <w:r>
-        <w:rPr>
-          <w:rStyle w:val="VerbatimChar"/>
-          <w:b/>
-          <w:bCs/>
-        </w:rPr>
-        <w:t xml:space="preserve">ba2</w:t>
-      </w:r>
-      <w:r>
-        <w:rPr>
-          <w:b/>
-          <w:bCs/>
-        </w:rPr>
-        <w:t xml:space="preserve">).</w:t>
-      </w:r>
-      <w:r>
-        <w:t xml:space="preserve"> </w:t>
-      </w:r>
-      <w:r>
-        <w:t xml:space="preserve">A(DBSR)/A(NIST) = 1.43 (455.403), 1.32 (493.408), 1.27 (614.171), 1.07</w:t>
-      </w:r>
-      <w:r>
-        <w:t xml:space="preserve"> </w:t>
-      </w:r>
-      <w:r>
-        <w:t xml:space="preserve">(585.367), 1.60 (649.690). Времена жизни 5d по E2: 62 с и 28 с. Запись сечений и</w:t>
-      </w:r>
-      <w:r>
-        <w:t xml:space="preserve"> </w:t>
-      </w:r>
-      <w:r>
-        <w:t xml:space="preserve">констант проверена на неполном наборе парциальных волн.</w:t>
+        <w:t xml:space="preserve">493.408 ← Fe I 493.400 (1820), 553.548 ← Fe I 553.542 (1260), 455.403 ← Cr I 455.395 (18):</w:t>
+      </w:r>
+      <w:r>
+        <w:t xml:space="preserve"> </w:t>
+      </w:r>
+      <w:r>
+        <w:t xml:space="preserve">в сотни–тысячи раз слабее сильнейших линий Fe I и Cr I, которые в A3 едва видны (S/N 3–6) —</w:t>
+      </w:r>
+      <w:r>
+        <w:t xml:space="preserve"> </w:t>
+      </w:r>
+      <w:r>
+        <w:t xml:space="preserve">вклад пренебрежим.</w:t>
       </w:r>
     </w:p>
     <w:p>
@@ -11587,11 +12212,67 @@
         </w:numPr>
       </w:pPr>
       <w:r>
+        <w:t xml:space="preserve">543.896, 557.219, 561.667 — соседей нет; 545.045 — Fe II 545.009 (36 пм, Fe II не виден).</w:t>
+      </w:r>
+    </w:p>
+    <w:bookmarkEnd w:id="31"/>
+    <w:bookmarkStart w:id="32" w:name="X6d6f47a680e26386468108ba5d9a370d9572a0e"/>
+    <w:p>
+      <w:pPr>
+        <w:pStyle w:val="Heading2"/>
+      </w:pPr>
+      <w:r>
+        <w:t xml:space="preserve">3. Тестовый прогон (4 ядра)</w:t>
+      </w:r>
+    </w:p>
+    <w:p>
+      <w:pPr>
+        <w:pStyle w:val="Compact"/>
+        <w:numPr>
+          <w:ilvl w:val="0"/>
+          <w:numId w:val="1036"/>
+        </w:numPr>
+      </w:pPr>
+      <w:r>
         <w:rPr>
           <w:b/>
           <w:bCs/>
         </w:rPr>
-        <w:t xml:space="preserve">Ba I (</w:t>
+        <w:t xml:space="preserve">Xe⁺, мишень и A.</w:t>
+      </w:r>
+      <w:r>
+        <w:t xml:space="preserve"> </w:t>
+      </w:r>
+      <w:r>
+        <w:t xml:space="preserve">Мишень — 4 мин 40 с; E1-ветви 19 уровней 6p — секунды. Против NIST:</w:t>
+      </w:r>
+      <w:r>
+        <w:t xml:space="preserve"> </w:t>
+      </w:r>
+      <w:r>
+        <w:t xml:space="preserve">21 линия, медиана DBSR/NIST = 1.03, 13 из 21 в пределах ×2. Проверка по спектру A3 — п. 6</w:t>
+      </w:r>
+      <w:r>
+        <w:t xml:space="preserve"> </w:t>
+      </w:r>
+      <w:r>
+        <w:t xml:space="preserve">Части 1.</w:t>
+      </w:r>
+    </w:p>
+    <w:p>
+      <w:pPr>
+        <w:pStyle w:val="Compact"/>
+        <w:numPr>
+          <w:ilvl w:val="0"/>
+          <w:numId w:val="1036"/>
+        </w:numPr>
+      </w:pPr>
+      <w:r>
+        <w:rPr>
+          <w:b/>
+          <w:bCs/>
+        </w:rPr>
+        <w:t xml:space="preserve">Ba II (</w:t>
       </w:r>
       <w:r>
         <w:rPr>
@@ -11599,7 +12280,7 @@
           <w:b/>
           <w:bCs/>
         </w:rPr>
-        <w:t xml:space="preserve">ba1</w:t>
+        <w:t xml:space="preserve">ba2</w:t>
       </w:r>
       <w:r>
         <w:rPr>
@@ -11612,19 +12293,19 @@
         <w:t xml:space="preserve"> </w:t>
       </w:r>
       <w:r>
-        <w:t xml:space="preserve">Мишень и A — 2 мин 20 с, 39 из 49 состояний сопоставлены с NIST. Для</w:t>
-      </w:r>
-      <w:r>
-        <w:t xml:space="preserve"> </w:t>
-      </w:r>
-      <w:r>
-        <w:t xml:space="preserve">553.548 A(DBSR)/A(NIST) = 1.11, gf = 1.81 (f = 1.64 по Fursa). По 52 линиям Ba I 25 в</w:t>
-      </w:r>
-      <w:r>
-        <w:t xml:space="preserve"> </w:t>
-      </w:r>
-      <w:r>
-        <w:t xml:space="preserve">пределах ×2.</w:t>
+        <w:t xml:space="preserve">A(DBSR)/A(NIST) = 1.43 (455.403), 1.32 (493.408), 1.27 (614.171), 1.07</w:t>
+      </w:r>
+      <w:r>
+        <w:t xml:space="preserve"> </w:t>
+      </w:r>
+      <w:r>
+        <w:t xml:space="preserve">(585.367), 1.60 (649.690). Времена жизни 5d по E2: 62 с и 28 с. Запись сечений и</w:t>
+      </w:r>
+      <w:r>
+        <w:t xml:space="preserve"> </w:t>
+      </w:r>
+      <w:r>
+        <w:t xml:space="preserve">констант проверена на неполном наборе парциальных волн.</w:t>
       </w:r>
     </w:p>
     <w:p>
@@ -11632,7 +12313,7 @@
         <w:pStyle w:val="Compact"/>
         <w:numPr>
           <w:ilvl w:val="0"/>
-          <w:numId w:val="1035"/>
+          <w:numId w:val="1036"/>
         </w:numPr>
       </w:pPr>
       <w:r>
@@ -11640,55 +12321,40 @@
           <w:b/>
           <w:bCs/>
         </w:rPr>
-        <w:t xml:space="preserve">Xe⁺, рассеяние в модели Ванга (ноутбук 05, проверка J = 0, 2 парциальные волны).</w:t>
-      </w:r>
-      <w:r>
-        <w:t xml:space="preserve"> </w:t>
-      </w:r>
-      <w:r>
-        <w:t xml:space="preserve">Всего</w:t>
-      </w:r>
-      <w:r>
-        <w:t xml:space="preserve"> </w:t>
-      </w:r>
-      <w:r>
-        <w:t xml:space="preserve">3 ч на 4 ядрах: каждая волна (68 каналов, матрица 11 441) — ~65 мин диагонализации</w:t>
-      </w:r>
-      <w:r>
-        <w:t xml:space="preserve"> </w:t>
-      </w:r>
-      <w:r>
-        <w:t xml:space="preserve">(dbsr_hd3 шёл в один поток), внешняя область на 2200 энергиях — 45 мин. Полный расчёт</w:t>
-      </w:r>
-      <w:r>
-        <w:t xml:space="preserve"> </w:t>
-      </w:r>
-      <w:r>
-        <w:t xml:space="preserve">(J ≤ 25, ~50 волн с бо́льшими матрицами) — сервер, порядка суток и больше; проверьте, что</w:t>
-      </w:r>
-      <w:r>
-        <w:t xml:space="preserve"> </w:t>
-      </w:r>
-      <w:r>
-        <w:t xml:space="preserve">диагонализация идёт в несколько потоков. Ноутбук 05 на этих данных прошёл целиком.</w:t>
-      </w:r>
-      <w:r>
-        <w:t xml:space="preserve"> </w:t>
-      </w:r>
-      <w:r>
-        <w:t xml:space="preserve">Уже надёжно (не зависит от J): уровень 29 (553.107) питается каскадами сильнее всех —</w:t>
-      </w:r>
-      <w:r>
-        <w:t xml:space="preserve"> </w:t>
-      </w:r>
-      <w:r>
-        <w:t xml:space="preserve">P = 0.95 с уровня 34 и 0.45 с уровня 38 (5d); у остальных выбранных уровней P ≤ 0.23</w:t>
-      </w:r>
-      <w:r>
-        <w:t xml:space="preserve"> </w:t>
-      </w:r>
-      <w:r>
-        <w:t xml:space="preserve">(41 ← 87, 7s) и ≤ 0.07.</w:t>
+        <w:t xml:space="preserve">Ba I (</w:t>
+      </w:r>
+      <w:r>
+        <w:rPr>
+          <w:rStyle w:val="VerbatimChar"/>
+          <w:b/>
+          <w:bCs/>
+        </w:rPr>
+        <w:t xml:space="preserve">ba1</w:t>
+      </w:r>
+      <w:r>
+        <w:rPr>
+          <w:b/>
+          <w:bCs/>
+        </w:rPr>
+        <w:t xml:space="preserve">).</w:t>
+      </w:r>
+      <w:r>
+        <w:t xml:space="preserve"> </w:t>
+      </w:r>
+      <w:r>
+        <w:t xml:space="preserve">Мишень и A — 2 мин 20 с, 39 из 49 состояний сопоставлены с NIST. Для</w:t>
+      </w:r>
+      <w:r>
+        <w:t xml:space="preserve"> </w:t>
+      </w:r>
+      <w:r>
+        <w:t xml:space="preserve">553.548 A(DBSR)/A(NIST) = 1.11, gf = 1.81 (f = 1.64 по Fursa). По 52 линиям Ba I 25 в</w:t>
+      </w:r>
+      <w:r>
+        <w:t xml:space="preserve"> </w:t>
+      </w:r>
+      <w:r>
+        <w:t xml:space="preserve">пределах ×2.</w:t>
       </w:r>
     </w:p>
     <w:p>
@@ -11696,7 +12362,71 @@
         <w:pStyle w:val="Compact"/>
         <w:numPr>
           <w:ilvl w:val="0"/>
-          <w:numId w:val="1035"/>
+          <w:numId w:val="1036"/>
+        </w:numPr>
+      </w:pPr>
+      <w:r>
+        <w:rPr>
+          <w:b/>
+          <w:bCs/>
+        </w:rPr>
+        <w:t xml:space="preserve">Xe⁺, рассеяние в модели Ванга (ноутбук 05, проверка J = 0, 2 парциальные волны).</w:t>
+      </w:r>
+      <w:r>
+        <w:t xml:space="preserve"> </w:t>
+      </w:r>
+      <w:r>
+        <w:t xml:space="preserve">Всего</w:t>
+      </w:r>
+      <w:r>
+        <w:t xml:space="preserve"> </w:t>
+      </w:r>
+      <w:r>
+        <w:t xml:space="preserve">3 ч на 4 ядрах: каждая волна (68 каналов, матрица 11 441) — ~65 мин диагонализации</w:t>
+      </w:r>
+      <w:r>
+        <w:t xml:space="preserve"> </w:t>
+      </w:r>
+      <w:r>
+        <w:t xml:space="preserve">(dbsr_hd3 шёл в один поток), внешняя область на 2200 энергиях — 45 мин. Полный расчёт</w:t>
+      </w:r>
+      <w:r>
+        <w:t xml:space="preserve"> </w:t>
+      </w:r>
+      <w:r>
+        <w:t xml:space="preserve">(J ≤ 25, ~50 волн с бо́льшими матрицами) — сервер, порядка суток и больше; проверьте, что</w:t>
+      </w:r>
+      <w:r>
+        <w:t xml:space="preserve"> </w:t>
+      </w:r>
+      <w:r>
+        <w:t xml:space="preserve">диагонализация идёт в несколько потоков. Ноутбук 05 на этих данных прошёл целиком.</w:t>
+      </w:r>
+      <w:r>
+        <w:t xml:space="preserve"> </w:t>
+      </w:r>
+      <w:r>
+        <w:t xml:space="preserve">Уже надёжно (не зависит от J): уровень 29 (553.107) питается каскадами сильнее всех —</w:t>
+      </w:r>
+      <w:r>
+        <w:t xml:space="preserve"> </w:t>
+      </w:r>
+      <w:r>
+        <w:t xml:space="preserve">P = 0.95 с уровня 34 и 0.45 с уровня 38 (5d); у остальных выбранных уровней P ≤ 0.23</w:t>
+      </w:r>
+      <w:r>
+        <w:t xml:space="preserve"> </w:t>
+      </w:r>
+      <w:r>
+        <w:t xml:space="preserve">(41 ← 87, 7s) и ≤ 0.07.</w:t>
+      </w:r>
+    </w:p>
+    <w:p>
+      <w:pPr>
+        <w:pStyle w:val="Compact"/>
+        <w:numPr>
+          <w:ilvl w:val="0"/>
+          <w:numId w:val="1036"/>
         </w:numPr>
       </w:pPr>
       <w:r>
@@ -13303,6 +14033,9 @@
     <w:abstractNumId w:val="991"/>
   </w:num>
   <w:num w:numId="1035">
+    <w:abstractNumId w:val="991"/>
+  </w:num>
+  <w:num w:numId="1036">
     <w:abstractNumId w:val="991"/>
   </w:num>
 </w:numbering>

</xml_diff>